<commit_message>
Done report for lb4 and lb5
</commit_message>
<xml_diff>
--- a/Meshcheryakov_Aleksandr/lb3/Meshcheryakov_Aleksandr_lb3.docx
+++ b/Meshcheryakov_Aleksandr/lb3/Meshcheryakov_Aleksandr_lb3.docx
@@ -1444,63 +1444,6 @@
     </w:p>
     <w:p>
       <w:pPr>
-        <w:pStyle w:val="Normal"/>
-        <w:spacing w:lineRule="auto" w:line="360"/>
-        <w:jc w:val="center"/>
-        <w:rPr>
-          <w:color w:val="000000"/>
-          <w:sz w:val="28"/>
-          <w:szCs w:val="28"/>
-        </w:rPr>
-      </w:pPr>
-      <w:r>
-        <w:rPr>
-          <w:color w:val="000000"/>
-          <w:sz w:val="28"/>
-          <w:szCs w:val="28"/>
-        </w:rPr>
-      </w:r>
-    </w:p>
-    <w:p>
-      <w:pPr>
-        <w:pStyle w:val="Normal"/>
-        <w:spacing w:lineRule="auto" w:line="360"/>
-        <w:jc w:val="center"/>
-        <w:rPr>
-          <w:color w:val="000000"/>
-          <w:sz w:val="28"/>
-          <w:szCs w:val="28"/>
-        </w:rPr>
-      </w:pPr>
-      <w:r>
-        <w:rPr>
-          <w:color w:val="000000"/>
-          <w:sz w:val="28"/>
-          <w:szCs w:val="28"/>
-        </w:rPr>
-      </w:r>
-    </w:p>
-    <w:p>
-      <w:pPr>
-        <w:pStyle w:val="Normal"/>
-        <w:spacing w:lineRule="auto" w:line="360"/>
-        <w:jc w:val="center"/>
-        <w:rPr>
-          <w:color w:val="000000"/>
-          <w:sz w:val="28"/>
-          <w:szCs w:val="28"/>
-        </w:rPr>
-      </w:pPr>
-      <w:r>
-        <w:rPr>
-          <w:color w:val="000000"/>
-          <w:sz w:val="28"/>
-          <w:szCs w:val="28"/>
-        </w:rPr>
-      </w:r>
-    </w:p>
-    <w:p>
-      <w:pPr>
         <w:pStyle w:val="Heading2"/>
         <w:jc w:val="center"/>
         <w:rPr>
@@ -2119,7 +2062,7 @@
           <w:szCs w:val="28"/>
         </w:rPr>
         <w:tab/>
-        <w:t>Если найден отрезок [a,b], такой, что f (a) f (b), существует точка c, в которой значение функции равно нулю, т.е. f (с)=0, с пренадлежит (a,b). Метод бисекции состоит в построении последовательности вложенных друг в друга отрезков, на концах которых функция имеет разные знаки.</w:t>
+        <w:t>Если найден отрезок [a,b], такой, что f (a) f (b), существует точка c, в которой значение функции равно нулю, т.е. f (с)=0, с пренадлежит (a,b). Метод бисекции состоит в построении последовательности вложенных друг в друга отрезков, на концах которых функция имеет разные знаки.</w:t>
       </w:r>
     </w:p>
     <w:p>
@@ -2187,7 +2130,7 @@
           <w:szCs w:val="28"/>
         </w:rPr>
         <w:tab/>
-        <w:t>Рассмотрим один шаг итерационного процесса. Пусть на (n-1)-м шаге найден отрезок [an-1, bn-1] пренадлежащий [a, b], такой, что f (an-1) f (bn-1). Разделим его пополам точкой e = (an-1 +bn-1)/2 и вычислим f (e). Если f (e)=0, то e =( an-1+bn-1)/2- корень уравнения. Если f (e) !=   , то из двух половин отрезка выбирается та, на концах которой функция имеет противоположные знаки, поскольку искомый корень лежит на этой половине, т.е.</w:t>
+        <w:t>Рассмотрим один шаг итерационного процесса. Пусть на (n-1)-м шаге найден отрезок [an-1, bn-1] пренадлежащий [a, b], такой, что f (an-1) f (bn-1). Разделим его пополам точкой e = (an-1 +bn-1)/2 и вычислим f (e). Если f (e)=0, то e =( an-1+bn-1)/2- корень уравнения. Если f (e) !=   , то из двух половин отрезка выбирается та, на концах которой функция имеет противоположные знаки, поскольку искомый корень лежит на этой половине, т.е.</w:t>
       </w:r>
     </w:p>
     <w:p>
@@ -2322,7 +2265,7 @@
     </w:p>
     <w:p>
       <w:pPr>
-        <w:pStyle w:val="Heading2"/>
+        <w:pStyle w:val="Normal"/>
         <w:jc w:val="center"/>
         <w:rPr>
           <w:rFonts w:ascii="Times New Roman" w:hAnsi="Times New Roman"/>
@@ -2333,16 +2276,34 @@
       </w:pPr>
       <w:r>
         <w:rPr>
+          <w:color w:val="000000"/>
+          <w:sz w:val="28"/>
+          <w:szCs w:val="28"/>
+        </w:rPr>
+      </w:r>
+    </w:p>
+    <w:p>
+      <w:pPr>
+        <w:pStyle w:val="Normal"/>
+        <w:jc w:val="center"/>
+        <w:rPr>
           <w:rFonts w:ascii="Times New Roman" w:hAnsi="Times New Roman"/>
           <w:color w:val="000000"/>
           <w:sz w:val="28"/>
           <w:szCs w:val="28"/>
         </w:rPr>
-      </w:r>
-    </w:p>
-    <w:p>
-      <w:pPr>
-        <w:pStyle w:val="Heading2"/>
+      </w:pPr>
+      <w:r>
+        <w:rPr>
+          <w:color w:val="000000"/>
+          <w:sz w:val="28"/>
+          <w:szCs w:val="28"/>
+        </w:rPr>
+      </w:r>
+    </w:p>
+    <w:p>
+      <w:pPr>
+        <w:pStyle w:val="Normal"/>
         <w:jc w:val="center"/>
         <w:rPr>
           <w:rFonts w:ascii="Times New Roman" w:hAnsi="Times New Roman"/>
@@ -2353,16 +2314,34 @@
       </w:pPr>
       <w:r>
         <w:rPr>
+          <w:color w:val="000000"/>
+          <w:sz w:val="28"/>
+          <w:szCs w:val="28"/>
+        </w:rPr>
+      </w:r>
+    </w:p>
+    <w:p>
+      <w:pPr>
+        <w:pStyle w:val="Normal"/>
+        <w:jc w:val="center"/>
+        <w:rPr>
           <w:rFonts w:ascii="Times New Roman" w:hAnsi="Times New Roman"/>
           <w:color w:val="000000"/>
           <w:sz w:val="28"/>
           <w:szCs w:val="28"/>
         </w:rPr>
-      </w:r>
-    </w:p>
-    <w:p>
-      <w:pPr>
-        <w:pStyle w:val="Heading2"/>
+      </w:pPr>
+      <w:r>
+        <w:rPr>
+          <w:color w:val="000000"/>
+          <w:sz w:val="28"/>
+          <w:szCs w:val="28"/>
+        </w:rPr>
+      </w:r>
+    </w:p>
+    <w:p>
+      <w:pPr>
+        <w:pStyle w:val="Normal"/>
         <w:jc w:val="center"/>
         <w:rPr>
           <w:rFonts w:ascii="Times New Roman" w:hAnsi="Times New Roman"/>
@@ -2373,16 +2352,34 @@
       </w:pPr>
       <w:r>
         <w:rPr>
+          <w:color w:val="000000"/>
+          <w:sz w:val="28"/>
+          <w:szCs w:val="28"/>
+        </w:rPr>
+      </w:r>
+    </w:p>
+    <w:p>
+      <w:pPr>
+        <w:pStyle w:val="Normal"/>
+        <w:jc w:val="center"/>
+        <w:rPr>
           <w:rFonts w:ascii="Times New Roman" w:hAnsi="Times New Roman"/>
           <w:color w:val="000000"/>
           <w:sz w:val="28"/>
           <w:szCs w:val="28"/>
         </w:rPr>
-      </w:r>
-    </w:p>
-    <w:p>
-      <w:pPr>
-        <w:pStyle w:val="Heading2"/>
+      </w:pPr>
+      <w:r>
+        <w:rPr>
+          <w:color w:val="000000"/>
+          <w:sz w:val="28"/>
+          <w:szCs w:val="28"/>
+        </w:rPr>
+      </w:r>
+    </w:p>
+    <w:p>
+      <w:pPr>
+        <w:pStyle w:val="Normal"/>
         <w:jc w:val="center"/>
         <w:rPr>
           <w:rFonts w:ascii="Times New Roman" w:hAnsi="Times New Roman"/>
@@ -2393,16 +2390,34 @@
       </w:pPr>
       <w:r>
         <w:rPr>
+          <w:color w:val="000000"/>
+          <w:sz w:val="28"/>
+          <w:szCs w:val="28"/>
+        </w:rPr>
+      </w:r>
+    </w:p>
+    <w:p>
+      <w:pPr>
+        <w:pStyle w:val="Normal"/>
+        <w:jc w:val="center"/>
+        <w:rPr>
           <w:rFonts w:ascii="Times New Roman" w:hAnsi="Times New Roman"/>
           <w:color w:val="000000"/>
           <w:sz w:val="28"/>
           <w:szCs w:val="28"/>
         </w:rPr>
-      </w:r>
-    </w:p>
-    <w:p>
-      <w:pPr>
-        <w:pStyle w:val="Heading2"/>
+      </w:pPr>
+      <w:r>
+        <w:rPr>
+          <w:color w:val="000000"/>
+          <w:sz w:val="28"/>
+          <w:szCs w:val="28"/>
+        </w:rPr>
+      </w:r>
+    </w:p>
+    <w:p>
+      <w:pPr>
+        <w:pStyle w:val="Normal"/>
         <w:jc w:val="center"/>
         <w:rPr>
           <w:rFonts w:ascii="Times New Roman" w:hAnsi="Times New Roman"/>
@@ -2413,16 +2428,34 @@
       </w:pPr>
       <w:r>
         <w:rPr>
+          <w:color w:val="000000"/>
+          <w:sz w:val="28"/>
+          <w:szCs w:val="28"/>
+        </w:rPr>
+      </w:r>
+    </w:p>
+    <w:p>
+      <w:pPr>
+        <w:pStyle w:val="Normal"/>
+        <w:jc w:val="center"/>
+        <w:rPr>
           <w:rFonts w:ascii="Times New Roman" w:hAnsi="Times New Roman"/>
           <w:color w:val="000000"/>
           <w:sz w:val="28"/>
           <w:szCs w:val="28"/>
         </w:rPr>
-      </w:r>
-    </w:p>
-    <w:p>
-      <w:pPr>
-        <w:pStyle w:val="Heading2"/>
+      </w:pPr>
+      <w:r>
+        <w:rPr>
+          <w:color w:val="000000"/>
+          <w:sz w:val="28"/>
+          <w:szCs w:val="28"/>
+        </w:rPr>
+      </w:r>
+    </w:p>
+    <w:p>
+      <w:pPr>
+        <w:pStyle w:val="Normal"/>
         <w:jc w:val="center"/>
         <w:rPr>
           <w:rFonts w:ascii="Times New Roman" w:hAnsi="Times New Roman"/>
@@ -2433,16 +2466,34 @@
       </w:pPr>
       <w:r>
         <w:rPr>
+          <w:color w:val="000000"/>
+          <w:sz w:val="28"/>
+          <w:szCs w:val="28"/>
+        </w:rPr>
+      </w:r>
+    </w:p>
+    <w:p>
+      <w:pPr>
+        <w:pStyle w:val="Normal"/>
+        <w:jc w:val="center"/>
+        <w:rPr>
           <w:rFonts w:ascii="Times New Roman" w:hAnsi="Times New Roman"/>
           <w:color w:val="000000"/>
           <w:sz w:val="28"/>
           <w:szCs w:val="28"/>
         </w:rPr>
-      </w:r>
-    </w:p>
-    <w:p>
-      <w:pPr>
-        <w:pStyle w:val="Heading2"/>
+      </w:pPr>
+      <w:r>
+        <w:rPr>
+          <w:color w:val="000000"/>
+          <w:sz w:val="28"/>
+          <w:szCs w:val="28"/>
+        </w:rPr>
+      </w:r>
+    </w:p>
+    <w:p>
+      <w:pPr>
+        <w:pStyle w:val="Normal"/>
         <w:jc w:val="center"/>
         <w:rPr>
           <w:rFonts w:ascii="Times New Roman" w:hAnsi="Times New Roman"/>
@@ -2453,16 +2504,34 @@
       </w:pPr>
       <w:r>
         <w:rPr>
+          <w:color w:val="000000"/>
+          <w:sz w:val="28"/>
+          <w:szCs w:val="28"/>
+        </w:rPr>
+      </w:r>
+    </w:p>
+    <w:p>
+      <w:pPr>
+        <w:pStyle w:val="Normal"/>
+        <w:jc w:val="center"/>
+        <w:rPr>
           <w:rFonts w:ascii="Times New Roman" w:hAnsi="Times New Roman"/>
           <w:color w:val="000000"/>
           <w:sz w:val="28"/>
           <w:szCs w:val="28"/>
         </w:rPr>
-      </w:r>
-    </w:p>
-    <w:p>
-      <w:pPr>
-        <w:pStyle w:val="Heading2"/>
+      </w:pPr>
+      <w:r>
+        <w:rPr>
+          <w:color w:val="000000"/>
+          <w:sz w:val="28"/>
+          <w:szCs w:val="28"/>
+        </w:rPr>
+      </w:r>
+    </w:p>
+    <w:p>
+      <w:pPr>
+        <w:pStyle w:val="Normal"/>
         <w:jc w:val="center"/>
         <w:rPr>
           <w:rFonts w:ascii="Times New Roman" w:hAnsi="Times New Roman"/>
@@ -2473,16 +2542,34 @@
       </w:pPr>
       <w:r>
         <w:rPr>
+          <w:color w:val="000000"/>
+          <w:sz w:val="28"/>
+          <w:szCs w:val="28"/>
+        </w:rPr>
+      </w:r>
+    </w:p>
+    <w:p>
+      <w:pPr>
+        <w:pStyle w:val="Normal"/>
+        <w:jc w:val="center"/>
+        <w:rPr>
           <w:rFonts w:ascii="Times New Roman" w:hAnsi="Times New Roman"/>
           <w:color w:val="000000"/>
           <w:sz w:val="28"/>
           <w:szCs w:val="28"/>
         </w:rPr>
-      </w:r>
-    </w:p>
-    <w:p>
-      <w:pPr>
-        <w:pStyle w:val="Heading2"/>
+      </w:pPr>
+      <w:r>
+        <w:rPr>
+          <w:color w:val="000000"/>
+          <w:sz w:val="28"/>
+          <w:szCs w:val="28"/>
+        </w:rPr>
+      </w:r>
+    </w:p>
+    <w:p>
+      <w:pPr>
+        <w:pStyle w:val="Normal"/>
         <w:jc w:val="center"/>
         <w:rPr>
           <w:rFonts w:ascii="Times New Roman" w:hAnsi="Times New Roman"/>
@@ -2493,16 +2580,34 @@
       </w:pPr>
       <w:r>
         <w:rPr>
+          <w:color w:val="000000"/>
+          <w:sz w:val="28"/>
+          <w:szCs w:val="28"/>
+        </w:rPr>
+      </w:r>
+    </w:p>
+    <w:p>
+      <w:pPr>
+        <w:pStyle w:val="Normal"/>
+        <w:jc w:val="center"/>
+        <w:rPr>
           <w:rFonts w:ascii="Times New Roman" w:hAnsi="Times New Roman"/>
           <w:color w:val="000000"/>
           <w:sz w:val="28"/>
           <w:szCs w:val="28"/>
         </w:rPr>
-      </w:r>
-    </w:p>
-    <w:p>
-      <w:pPr>
-        <w:pStyle w:val="Heading2"/>
+      </w:pPr>
+      <w:r>
+        <w:rPr>
+          <w:color w:val="000000"/>
+          <w:sz w:val="28"/>
+          <w:szCs w:val="28"/>
+        </w:rPr>
+      </w:r>
+    </w:p>
+    <w:p>
+      <w:pPr>
+        <w:pStyle w:val="Normal"/>
         <w:jc w:val="center"/>
         <w:rPr>
           <w:rFonts w:ascii="Times New Roman" w:hAnsi="Times New Roman"/>
@@ -2513,16 +2618,34 @@
       </w:pPr>
       <w:r>
         <w:rPr>
+          <w:color w:val="000000"/>
+          <w:sz w:val="28"/>
+          <w:szCs w:val="28"/>
+        </w:rPr>
+      </w:r>
+    </w:p>
+    <w:p>
+      <w:pPr>
+        <w:pStyle w:val="Normal"/>
+        <w:jc w:val="center"/>
+        <w:rPr>
           <w:rFonts w:ascii="Times New Roman" w:hAnsi="Times New Roman"/>
           <w:color w:val="000000"/>
           <w:sz w:val="28"/>
           <w:szCs w:val="28"/>
         </w:rPr>
-      </w:r>
-    </w:p>
-    <w:p>
-      <w:pPr>
-        <w:pStyle w:val="Heading2"/>
+      </w:pPr>
+      <w:r>
+        <w:rPr>
+          <w:color w:val="000000"/>
+          <w:sz w:val="28"/>
+          <w:szCs w:val="28"/>
+        </w:rPr>
+      </w:r>
+    </w:p>
+    <w:p>
+      <w:pPr>
+        <w:pStyle w:val="Normal"/>
         <w:jc w:val="center"/>
         <w:rPr>
           <w:rFonts w:ascii="Times New Roman" w:hAnsi="Times New Roman"/>
@@ -2533,16 +2656,34 @@
       </w:pPr>
       <w:r>
         <w:rPr>
+          <w:color w:val="000000"/>
+          <w:sz w:val="28"/>
+          <w:szCs w:val="28"/>
+        </w:rPr>
+      </w:r>
+    </w:p>
+    <w:p>
+      <w:pPr>
+        <w:pStyle w:val="Normal"/>
+        <w:jc w:val="center"/>
+        <w:rPr>
           <w:rFonts w:ascii="Times New Roman" w:hAnsi="Times New Roman"/>
           <w:color w:val="000000"/>
           <w:sz w:val="28"/>
           <w:szCs w:val="28"/>
         </w:rPr>
-      </w:r>
-    </w:p>
-    <w:p>
-      <w:pPr>
-        <w:pStyle w:val="Heading2"/>
+      </w:pPr>
+      <w:r>
+        <w:rPr>
+          <w:color w:val="000000"/>
+          <w:sz w:val="28"/>
+          <w:szCs w:val="28"/>
+        </w:rPr>
+      </w:r>
+    </w:p>
+    <w:p>
+      <w:pPr>
+        <w:pStyle w:val="Normal"/>
         <w:jc w:val="center"/>
         <w:rPr>
           <w:rFonts w:ascii="Times New Roman" w:hAnsi="Times New Roman"/>
@@ -2553,16 +2694,34 @@
       </w:pPr>
       <w:r>
         <w:rPr>
+          <w:color w:val="000000"/>
+          <w:sz w:val="28"/>
+          <w:szCs w:val="28"/>
+        </w:rPr>
+      </w:r>
+    </w:p>
+    <w:p>
+      <w:pPr>
+        <w:pStyle w:val="Normal"/>
+        <w:jc w:val="center"/>
+        <w:rPr>
           <w:rFonts w:ascii="Times New Roman" w:hAnsi="Times New Roman"/>
           <w:color w:val="000000"/>
           <w:sz w:val="28"/>
           <w:szCs w:val="28"/>
         </w:rPr>
-      </w:r>
-    </w:p>
-    <w:p>
-      <w:pPr>
-        <w:pStyle w:val="Heading2"/>
+      </w:pPr>
+      <w:r>
+        <w:rPr>
+          <w:color w:val="000000"/>
+          <w:sz w:val="28"/>
+          <w:szCs w:val="28"/>
+        </w:rPr>
+      </w:r>
+    </w:p>
+    <w:p>
+      <w:pPr>
+        <w:pStyle w:val="Normal"/>
         <w:jc w:val="center"/>
         <w:rPr>
           <w:rFonts w:ascii="Times New Roman" w:hAnsi="Times New Roman"/>
@@ -2573,16 +2732,34 @@
       </w:pPr>
       <w:r>
         <w:rPr>
+          <w:color w:val="000000"/>
+          <w:sz w:val="28"/>
+          <w:szCs w:val="28"/>
+        </w:rPr>
+      </w:r>
+    </w:p>
+    <w:p>
+      <w:pPr>
+        <w:pStyle w:val="Normal"/>
+        <w:jc w:val="center"/>
+        <w:rPr>
           <w:rFonts w:ascii="Times New Roman" w:hAnsi="Times New Roman"/>
           <w:color w:val="000000"/>
           <w:sz w:val="28"/>
           <w:szCs w:val="28"/>
         </w:rPr>
-      </w:r>
-    </w:p>
-    <w:p>
-      <w:pPr>
-        <w:pStyle w:val="Heading2"/>
+      </w:pPr>
+      <w:r>
+        <w:rPr>
+          <w:color w:val="000000"/>
+          <w:sz w:val="28"/>
+          <w:szCs w:val="28"/>
+        </w:rPr>
+      </w:r>
+    </w:p>
+    <w:p>
+      <w:pPr>
+        <w:pStyle w:val="Normal"/>
         <w:jc w:val="center"/>
         <w:rPr>
           <w:rFonts w:ascii="Times New Roman" w:hAnsi="Times New Roman"/>
@@ -2593,16 +2770,34 @@
       </w:pPr>
       <w:r>
         <w:rPr>
+          <w:color w:val="000000"/>
+          <w:sz w:val="28"/>
+          <w:szCs w:val="28"/>
+        </w:rPr>
+      </w:r>
+    </w:p>
+    <w:p>
+      <w:pPr>
+        <w:pStyle w:val="Normal"/>
+        <w:jc w:val="center"/>
+        <w:rPr>
           <w:rFonts w:ascii="Times New Roman" w:hAnsi="Times New Roman"/>
           <w:color w:val="000000"/>
           <w:sz w:val="28"/>
           <w:szCs w:val="28"/>
         </w:rPr>
-      </w:r>
-    </w:p>
-    <w:p>
-      <w:pPr>
-        <w:pStyle w:val="Heading2"/>
+      </w:pPr>
+      <w:r>
+        <w:rPr>
+          <w:color w:val="000000"/>
+          <w:sz w:val="28"/>
+          <w:szCs w:val="28"/>
+        </w:rPr>
+      </w:r>
+    </w:p>
+    <w:p>
+      <w:pPr>
+        <w:pStyle w:val="Normal"/>
         <w:jc w:val="center"/>
         <w:rPr>
           <w:rFonts w:ascii="Times New Roman" w:hAnsi="Times New Roman"/>
@@ -2613,16 +2808,34 @@
       </w:pPr>
       <w:r>
         <w:rPr>
+          <w:color w:val="000000"/>
+          <w:sz w:val="28"/>
+          <w:szCs w:val="28"/>
+        </w:rPr>
+      </w:r>
+    </w:p>
+    <w:p>
+      <w:pPr>
+        <w:pStyle w:val="Normal"/>
+        <w:jc w:val="center"/>
+        <w:rPr>
           <w:rFonts w:ascii="Times New Roman" w:hAnsi="Times New Roman"/>
           <w:color w:val="000000"/>
           <w:sz w:val="28"/>
           <w:szCs w:val="28"/>
         </w:rPr>
-      </w:r>
-    </w:p>
-    <w:p>
-      <w:pPr>
-        <w:pStyle w:val="Heading2"/>
+      </w:pPr>
+      <w:r>
+        <w:rPr>
+          <w:color w:val="000000"/>
+          <w:sz w:val="28"/>
+          <w:szCs w:val="28"/>
+        </w:rPr>
+      </w:r>
+    </w:p>
+    <w:p>
+      <w:pPr>
+        <w:pStyle w:val="Normal"/>
         <w:jc w:val="center"/>
         <w:rPr>
           <w:rFonts w:ascii="Times New Roman" w:hAnsi="Times New Roman"/>
@@ -2633,16 +2846,34 @@
       </w:pPr>
       <w:r>
         <w:rPr>
+          <w:color w:val="000000"/>
+          <w:sz w:val="28"/>
+          <w:szCs w:val="28"/>
+        </w:rPr>
+      </w:r>
+    </w:p>
+    <w:p>
+      <w:pPr>
+        <w:pStyle w:val="Normal"/>
+        <w:jc w:val="center"/>
+        <w:rPr>
           <w:rFonts w:ascii="Times New Roman" w:hAnsi="Times New Roman"/>
           <w:color w:val="000000"/>
           <w:sz w:val="28"/>
           <w:szCs w:val="28"/>
         </w:rPr>
-      </w:r>
-    </w:p>
-    <w:p>
-      <w:pPr>
-        <w:pStyle w:val="Heading2"/>
+      </w:pPr>
+      <w:r>
+        <w:rPr>
+          <w:color w:val="000000"/>
+          <w:sz w:val="28"/>
+          <w:szCs w:val="28"/>
+        </w:rPr>
+      </w:r>
+    </w:p>
+    <w:p>
+      <w:pPr>
+        <w:pStyle w:val="Normal"/>
         <w:jc w:val="center"/>
         <w:rPr>
           <w:rFonts w:ascii="Times New Roman" w:hAnsi="Times New Roman"/>
@@ -2653,167 +2884,6 @@
       </w:pPr>
       <w:r>
         <w:rPr>
-          <w:rFonts w:ascii="Times New Roman" w:hAnsi="Times New Roman"/>
-          <w:color w:val="000000"/>
-          <w:sz w:val="28"/>
-          <w:szCs w:val="28"/>
-        </w:rPr>
-      </w:r>
-    </w:p>
-    <w:p>
-      <w:pPr>
-        <w:pStyle w:val="Heading2"/>
-        <w:jc w:val="center"/>
-        <w:rPr>
-          <w:rFonts w:ascii="Times New Roman" w:hAnsi="Times New Roman"/>
-          <w:color w:val="000000"/>
-          <w:sz w:val="28"/>
-          <w:szCs w:val="28"/>
-        </w:rPr>
-      </w:pPr>
-      <w:r>
-        <w:rPr>
-          <w:rFonts w:ascii="Times New Roman" w:hAnsi="Times New Roman"/>
-          <w:color w:val="000000"/>
-          <w:sz w:val="28"/>
-          <w:szCs w:val="28"/>
-        </w:rPr>
-      </w:r>
-    </w:p>
-    <w:p>
-      <w:pPr>
-        <w:pStyle w:val="Heading2"/>
-        <w:jc w:val="center"/>
-        <w:rPr>
-          <w:rFonts w:ascii="Times New Roman" w:hAnsi="Times New Roman"/>
-          <w:color w:val="000000"/>
-          <w:sz w:val="28"/>
-          <w:szCs w:val="28"/>
-        </w:rPr>
-      </w:pPr>
-      <w:r>
-        <w:rPr>
-          <w:rFonts w:ascii="Times New Roman" w:hAnsi="Times New Roman"/>
-          <w:color w:val="000000"/>
-          <w:sz w:val="28"/>
-          <w:szCs w:val="28"/>
-        </w:rPr>
-      </w:r>
-    </w:p>
-    <w:p>
-      <w:pPr>
-        <w:pStyle w:val="Heading2"/>
-        <w:jc w:val="center"/>
-        <w:rPr>
-          <w:rFonts w:ascii="Times New Roman" w:hAnsi="Times New Roman"/>
-          <w:color w:val="000000"/>
-          <w:sz w:val="28"/>
-          <w:szCs w:val="28"/>
-        </w:rPr>
-      </w:pPr>
-      <w:r>
-        <w:rPr>
-          <w:rFonts w:ascii="Times New Roman" w:hAnsi="Times New Roman"/>
-          <w:color w:val="000000"/>
-          <w:sz w:val="28"/>
-          <w:szCs w:val="28"/>
-        </w:rPr>
-      </w:r>
-    </w:p>
-    <w:p>
-      <w:pPr>
-        <w:pStyle w:val="Heading2"/>
-        <w:jc w:val="center"/>
-        <w:rPr>
-          <w:rFonts w:ascii="Times New Roman" w:hAnsi="Times New Roman"/>
-          <w:color w:val="000000"/>
-          <w:sz w:val="28"/>
-          <w:szCs w:val="28"/>
-        </w:rPr>
-      </w:pPr>
-      <w:r>
-        <w:rPr>
-          <w:rFonts w:ascii="Times New Roman" w:hAnsi="Times New Roman"/>
-          <w:color w:val="000000"/>
-          <w:sz w:val="28"/>
-          <w:szCs w:val="28"/>
-        </w:rPr>
-      </w:r>
-    </w:p>
-    <w:p>
-      <w:pPr>
-        <w:pStyle w:val="Heading2"/>
-        <w:jc w:val="center"/>
-        <w:rPr>
-          <w:rFonts w:ascii="Times New Roman" w:hAnsi="Times New Roman"/>
-          <w:color w:val="000000"/>
-          <w:sz w:val="28"/>
-          <w:szCs w:val="28"/>
-        </w:rPr>
-      </w:pPr>
-      <w:r>
-        <w:rPr>
-          <w:rFonts w:ascii="Times New Roman" w:hAnsi="Times New Roman"/>
-          <w:color w:val="000000"/>
-          <w:sz w:val="28"/>
-          <w:szCs w:val="28"/>
-        </w:rPr>
-      </w:r>
-    </w:p>
-    <w:p>
-      <w:pPr>
-        <w:pStyle w:val="Heading2"/>
-        <w:jc w:val="center"/>
-        <w:rPr>
-          <w:rFonts w:ascii="Times New Roman" w:hAnsi="Times New Roman"/>
-          <w:color w:val="000000"/>
-          <w:sz w:val="28"/>
-          <w:szCs w:val="28"/>
-        </w:rPr>
-      </w:pPr>
-      <w:r>
-        <w:rPr>
-          <w:rFonts w:ascii="Times New Roman" w:hAnsi="Times New Roman"/>
-          <w:color w:val="000000"/>
-          <w:sz w:val="28"/>
-          <w:szCs w:val="28"/>
-        </w:rPr>
-      </w:r>
-    </w:p>
-    <w:p>
-      <w:pPr>
-        <w:pStyle w:val="Heading2"/>
-        <w:jc w:val="center"/>
-        <w:rPr>
-          <w:rFonts w:ascii="Times New Roman" w:hAnsi="Times New Roman"/>
-          <w:color w:val="000000"/>
-          <w:sz w:val="28"/>
-          <w:szCs w:val="28"/>
-        </w:rPr>
-      </w:pPr>
-      <w:r>
-        <w:rPr>
-          <w:rFonts w:ascii="Times New Roman" w:hAnsi="Times New Roman"/>
-          <w:color w:val="000000"/>
-          <w:sz w:val="28"/>
-          <w:szCs w:val="28"/>
-        </w:rPr>
-      </w:r>
-    </w:p>
-    <w:p>
-      <w:pPr>
-        <w:pStyle w:val="Heading2"/>
-        <w:jc w:val="center"/>
-        <w:rPr>
-          <w:rFonts w:ascii="Times New Roman" w:hAnsi="Times New Roman"/>
-          <w:color w:val="000000"/>
-          <w:sz w:val="28"/>
-          <w:szCs w:val="28"/>
-        </w:rPr>
-      </w:pPr>
-      <w:r>
-        <w:rPr>
-          <w:rFonts w:ascii="Times New Roman" w:hAnsi="Times New Roman"/>
           <w:color w:val="000000"/>
           <w:sz w:val="28"/>
           <w:szCs w:val="28"/>
@@ -2973,7 +3043,7 @@
     </w:p>
     <w:p>
       <w:pPr>
-        <w:pStyle w:val="Normal"/>
+        <w:pStyle w:val="Heading2"/>
         <w:numPr>
           <w:ilvl w:val="0"/>
           <w:numId w:val="0"/>
@@ -2983,24 +3053,1558 @@
         <w:jc w:val="both"/>
         <w:rPr>
           <w:rFonts w:ascii="Times New Roman" w:hAnsi="Times New Roman"/>
-          <w:sz w:val="28"/>
-          <w:szCs w:val="28"/>
-        </w:rPr>
-      </w:pPr>
+          <w:b/>
+          <w:bCs/>
+          <w:color w:val="000000"/>
+        </w:rPr>
+      </w:pPr>
+      <w:r>
+        <w:rPr>
+          <w:rFonts w:ascii="Times New Roman" w:hAnsi="Times New Roman"/>
+          <w:b/>
+          <w:bCs/>
+          <w:color w:val="000000"/>
+          <w:sz w:val="28"/>
+          <w:szCs w:val="28"/>
+        </w:rPr>
+        <w:t>Отделение корней уравнения</w:t>
+      </w:r>
+    </w:p>
+    <w:p>
+      <w:pPr>
+        <w:pStyle w:val="BodyText"/>
+        <w:spacing w:lineRule="auto" w:line="360" w:before="0" w:after="283"/>
+        <w:ind w:hanging="0" w:left="0" w:right="0"/>
+        <w:jc w:val="both"/>
+        <w:rPr>
+          <w:rFonts w:ascii="Times New Roman" w:hAnsi="Times New Roman"/>
+          <w:b w:val="false"/>
+          <w:bCs w:val="false"/>
+        </w:rPr>
+      </w:pPr>
+      <w:r>
+        <w:rPr>
+          <w:rFonts w:ascii="Times New Roman" w:hAnsi="Times New Roman"/>
+          <w:b w:val="false"/>
+          <w:bCs w:val="false"/>
+        </w:rPr>
+        <w:t xml:space="preserve">Рассмотрим функцию </w:t>
+      </w:r>
+      <w:r>
+        <w:rPr>
+          <w:rFonts w:ascii="Times New Roman" w:hAnsi="Times New Roman"/>
+          <w:b w:val="false"/>
+          <w:bCs w:val="false"/>
+        </w:rPr>
+      </w:r>
+      <m:oMath xmlns:m="http://schemas.openxmlformats.org/officeDocument/2006/math">
+        <m:r>
+          <w:rPr>
+            <w:rFonts w:ascii="Cambria Math" w:hAnsi="Cambria Math"/>
+          </w:rPr>
+          <m:t xml:space="preserve">f</m:t>
+        </m:r>
+        <m:d>
+          <m:dPr>
+            <m:begChr m:val="("/>
+            <m:endChr m:val=")"/>
+          </m:dPr>
+          <m:e>
+            <m:r>
+              <w:rPr>
+                <w:rFonts w:ascii="Cambria Math" w:hAnsi="Cambria Math"/>
+              </w:rPr>
+              <m:t xml:space="preserve">x</m:t>
+            </m:r>
+          </m:e>
+        </m:d>
+        <m:r>
+          <w:rPr>
+            <w:rFonts w:ascii="Cambria Math" w:hAnsi="Cambria Math"/>
+          </w:rPr>
+          <m:t xml:space="preserve">=</m:t>
+        </m:r>
+        <m:f>
+          <m:num>
+            <m:r>
+              <w:rPr>
+                <w:rFonts w:ascii="Cambria Math" w:hAnsi="Cambria Math"/>
+              </w:rPr>
+              <m:t xml:space="preserve">1</m:t>
+            </m:r>
+            <m:r>
+              <w:rPr>
+                <w:rFonts w:ascii="Cambria Math" w:hAnsi="Cambria Math"/>
+              </w:rPr>
+              <m:t xml:space="preserve">+</m:t>
+            </m:r>
+            <m:r>
+              <w:rPr>
+                <w:rFonts w:ascii="Cambria Math" w:hAnsi="Cambria Math"/>
+              </w:rPr>
+              <m:t xml:space="preserve">cos</m:t>
+            </m:r>
+            <m:d>
+              <m:dPr>
+                <m:begChr m:val="("/>
+                <m:endChr m:val=")"/>
+              </m:dPr>
+              <m:e>
+                <m:r>
+                  <w:rPr>
+                    <w:rFonts w:ascii="Cambria Math" w:hAnsi="Cambria Math"/>
+                  </w:rPr>
+                  <m:t xml:space="preserve">x</m:t>
+                </m:r>
+              </m:e>
+            </m:d>
+          </m:num>
+          <m:den>
+            <m:r>
+              <w:rPr>
+                <w:rFonts w:ascii="Cambria Math" w:hAnsi="Cambria Math"/>
+              </w:rPr>
+              <m:t xml:space="preserve">3</m:t>
+            </m:r>
+            <m:r>
+              <w:rPr>
+                <w:rFonts w:ascii="Cambria Math" w:hAnsi="Cambria Math"/>
+              </w:rPr>
+              <m:t xml:space="preserve">−</m:t>
+            </m:r>
+            <m:r>
+              <w:rPr>
+                <w:rFonts w:ascii="Cambria Math" w:hAnsi="Cambria Math"/>
+              </w:rPr>
+              <m:t xml:space="preserve">sin</m:t>
+            </m:r>
+            <m:d>
+              <m:dPr>
+                <m:begChr m:val="("/>
+                <m:endChr m:val=")"/>
+              </m:dPr>
+              <m:e>
+                <m:r>
+                  <w:rPr>
+                    <w:rFonts w:ascii="Cambria Math" w:hAnsi="Cambria Math"/>
+                  </w:rPr>
+                  <m:t xml:space="preserve">x</m:t>
+                </m:r>
+              </m:e>
+            </m:d>
+          </m:den>
+        </m:f>
+        <m:r>
+          <w:rPr>
+            <w:rFonts w:ascii="Cambria Math" w:hAnsi="Cambria Math"/>
+          </w:rPr>
+          <m:t xml:space="preserve">​</m:t>
+        </m:r>
+        <m:r>
+          <w:rPr>
+            <w:rFonts w:ascii="Cambria Math" w:hAnsi="Cambria Math"/>
+          </w:rPr>
+          <m:t xml:space="preserve">−</m:t>
+        </m:r>
+        <m:r>
+          <w:rPr>
+            <w:rFonts w:ascii="Cambria Math" w:hAnsi="Cambria Math"/>
+          </w:rPr>
+          <m:t xml:space="preserve">x</m:t>
+        </m:r>
+      </m:oMath>
+      <w:r>
+        <w:rPr>
+          <w:rFonts w:ascii="Times New Roman" w:hAnsi="Times New Roman"/>
+          <w:b w:val="false"/>
+          <w:bCs w:val="false"/>
+        </w:rPr>
+        <w:t>. Она определена и непрерывна на всей числовой прямой, так как знаменатель 3 − sin(x) никогда не обращается в нуль (поскольку ∣sin(x)∣≤1).</w:t>
+      </w:r>
+    </w:p>
+    <w:p>
+      <w:pPr>
+        <w:pStyle w:val="BodyText"/>
+        <w:spacing w:lineRule="auto" w:line="360" w:before="0" w:after="283"/>
+        <w:jc w:val="both"/>
+        <w:rPr>
+          <w:rFonts w:ascii="Times New Roman" w:hAnsi="Times New Roman"/>
+          <w:b w:val="false"/>
+          <w:bCs w:val="false"/>
+        </w:rPr>
+      </w:pPr>
+      <w:r>
+        <w:rPr>
+          <w:rFonts w:ascii="Times New Roman" w:hAnsi="Times New Roman"/>
+          <w:b w:val="false"/>
+          <w:bCs w:val="false"/>
+        </w:rPr>
+        <w:t>Ее производная равна:</w:t>
+      </w:r>
+    </w:p>
+    <w:p>
+      <w:pPr>
+        <w:pStyle w:val="BodyText"/>
+        <w:spacing w:lineRule="auto" w:line="360" w:before="0" w:after="283"/>
+        <w:ind w:hanging="0" w:left="0" w:right="0"/>
+        <w:jc w:val="both"/>
+        <w:rPr>
+          <w:rFonts w:ascii="Times New Roman" w:hAnsi="Times New Roman"/>
+          <w:b w:val="false"/>
+          <w:bCs w:val="false"/>
+        </w:rPr>
+      </w:pPr>
+      <w:r>
+        <w:rPr>
+          <w:rFonts w:ascii="Times New Roman" w:hAnsi="Times New Roman"/>
+          <w:b w:val="false"/>
+          <w:bCs w:val="false"/>
+        </w:rPr>
+      </w:r>
+      <m:oMathPara xmlns:m="http://schemas.openxmlformats.org/officeDocument/2006/math">
+        <m:oMathParaPr>
+          <m:jc m:val="left"/>
+        </m:oMathParaPr>
+        <m:oMath>
+          <m:r>
+            <w:rPr>
+              <w:rFonts w:ascii="Cambria Math" w:hAnsi="Cambria Math"/>
+            </w:rPr>
+            <m:t xml:space="preserve">f</m:t>
+          </m:r>
+          <m:r>
+            <w:rPr>
+              <w:rFonts w:ascii="Cambria Math" w:hAnsi="Cambria Math"/>
+            </w:rPr>
+            <m:t xml:space="preserve">′</m:t>
+          </m:r>
+          <m:d>
+            <m:dPr>
+              <m:begChr m:val="("/>
+              <m:endChr m:val=")"/>
+            </m:dPr>
+            <m:e>
+              <m:r>
+                <w:rPr>
+                  <w:rFonts w:ascii="Cambria Math" w:hAnsi="Cambria Math"/>
+                </w:rPr>
+                <m:t xml:space="preserve">x</m:t>
+              </m:r>
+            </m:e>
+          </m:d>
+          <m:r>
+            <w:rPr>
+              <w:rFonts w:ascii="Cambria Math" w:hAnsi="Cambria Math"/>
+            </w:rPr>
+            <m:t xml:space="preserve">=</m:t>
+          </m:r>
+          <m:f>
+            <m:num>
+              <m:r>
+                <w:rPr>
+                  <w:rFonts w:ascii="Cambria Math" w:hAnsi="Cambria Math"/>
+                </w:rPr>
+                <m:t xml:space="preserve">−</m:t>
+              </m:r>
+              <m:r>
+                <w:rPr>
+                  <w:rFonts w:ascii="Cambria Math" w:hAnsi="Cambria Math"/>
+                </w:rPr>
+                <m:t xml:space="preserve">sin</m:t>
+              </m:r>
+              <m:d>
+                <m:dPr>
+                  <m:begChr m:val="("/>
+                  <m:endChr m:val=")"/>
+                </m:dPr>
+                <m:e>
+                  <m:r>
+                    <w:rPr>
+                      <w:rFonts w:ascii="Cambria Math" w:hAnsi="Cambria Math"/>
+                    </w:rPr>
+                    <m:t xml:space="preserve">x</m:t>
+                  </m:r>
+                </m:e>
+              </m:d>
+              <m:d>
+                <m:dPr>
+                  <m:begChr m:val="("/>
+                  <m:endChr m:val=")"/>
+                </m:dPr>
+                <m:e>
+                  <m:r>
+                    <w:rPr>
+                      <w:rFonts w:ascii="Cambria Math" w:hAnsi="Cambria Math"/>
+                    </w:rPr>
+                    <m:t xml:space="preserve">3</m:t>
+                  </m:r>
+                  <m:r>
+                    <w:rPr>
+                      <w:rFonts w:ascii="Cambria Math" w:hAnsi="Cambria Math"/>
+                    </w:rPr>
+                    <m:t xml:space="preserve">−</m:t>
+                  </m:r>
+                  <m:r>
+                    <w:rPr>
+                      <w:rFonts w:ascii="Cambria Math" w:hAnsi="Cambria Math"/>
+                    </w:rPr>
+                    <m:t xml:space="preserve">sin</m:t>
+                  </m:r>
+                  <m:d>
+                    <m:dPr>
+                      <m:begChr m:val="("/>
+                      <m:endChr m:val=")"/>
+                    </m:dPr>
+                    <m:e>
+                      <m:r>
+                        <w:rPr>
+                          <w:rFonts w:ascii="Cambria Math" w:hAnsi="Cambria Math"/>
+                        </w:rPr>
+                        <m:t xml:space="preserve">x</m:t>
+                      </m:r>
+                    </m:e>
+                  </m:d>
+                </m:e>
+              </m:d>
+              <m:r>
+                <w:rPr>
+                  <w:rFonts w:ascii="Cambria Math" w:hAnsi="Cambria Math"/>
+                </w:rPr>
+                <m:t xml:space="preserve">−</m:t>
+              </m:r>
+              <m:d>
+                <m:dPr>
+                  <m:begChr m:val="("/>
+                  <m:endChr m:val=")"/>
+                </m:dPr>
+                <m:e>
+                  <m:r>
+                    <w:rPr>
+                      <w:rFonts w:ascii="Cambria Math" w:hAnsi="Cambria Math"/>
+                    </w:rPr>
+                    <m:t xml:space="preserve">1</m:t>
+                  </m:r>
+                  <m:r>
+                    <w:rPr>
+                      <w:rFonts w:ascii="Cambria Math" w:hAnsi="Cambria Math"/>
+                    </w:rPr>
+                    <m:t xml:space="preserve">+</m:t>
+                  </m:r>
+                  <m:r>
+                    <w:rPr>
+                      <w:rFonts w:ascii="Cambria Math" w:hAnsi="Cambria Math"/>
+                    </w:rPr>
+                    <m:t xml:space="preserve">cos</m:t>
+                  </m:r>
+                  <m:d>
+                    <m:dPr>
+                      <m:begChr m:val="("/>
+                      <m:endChr m:val=")"/>
+                    </m:dPr>
+                    <m:e>
+                      <m:r>
+                        <w:rPr>
+                          <w:rFonts w:ascii="Cambria Math" w:hAnsi="Cambria Math"/>
+                        </w:rPr>
+                        <m:t xml:space="preserve">x</m:t>
+                      </m:r>
+                    </m:e>
+                  </m:d>
+                </m:e>
+              </m:d>
+              <m:d>
+                <m:dPr>
+                  <m:begChr m:val="("/>
+                  <m:endChr m:val=")"/>
+                </m:dPr>
+                <m:e>
+                  <m:r>
+                    <w:rPr>
+                      <w:rFonts w:ascii="Cambria Math" w:hAnsi="Cambria Math"/>
+                    </w:rPr>
+                    <m:t xml:space="preserve">−</m:t>
+                  </m:r>
+                  <m:r>
+                    <w:rPr>
+                      <w:rFonts w:ascii="Cambria Math" w:hAnsi="Cambria Math"/>
+                    </w:rPr>
+                    <m:t xml:space="preserve">cos</m:t>
+                  </m:r>
+                  <m:d>
+                    <m:dPr>
+                      <m:begChr m:val="("/>
+                      <m:endChr m:val=")"/>
+                    </m:dPr>
+                    <m:e>
+                      <m:r>
+                        <w:rPr>
+                          <w:rFonts w:ascii="Cambria Math" w:hAnsi="Cambria Math"/>
+                        </w:rPr>
+                        <m:t xml:space="preserve">x</m:t>
+                      </m:r>
+                    </m:e>
+                  </m:d>
+                </m:e>
+              </m:d>
+            </m:num>
+            <m:den>
+              <m:sSup>
+                <m:e>
+                  <m:d>
+                    <m:dPr>
+                      <m:begChr m:val="("/>
+                      <m:endChr m:val=")"/>
+                    </m:dPr>
+                    <m:e>
+                      <m:r>
+                        <w:rPr>
+                          <w:rFonts w:ascii="Cambria Math" w:hAnsi="Cambria Math"/>
+                        </w:rPr>
+                        <m:t xml:space="preserve">3</m:t>
+                      </m:r>
+                      <m:r>
+                        <w:rPr>
+                          <w:rFonts w:ascii="Cambria Math" w:hAnsi="Cambria Math"/>
+                        </w:rPr>
+                        <m:t xml:space="preserve">−</m:t>
+                      </m:r>
+                      <m:r>
+                        <w:rPr>
+                          <w:rFonts w:ascii="Cambria Math" w:hAnsi="Cambria Math"/>
+                        </w:rPr>
+                        <m:t xml:space="preserve">sin</m:t>
+                      </m:r>
+                      <m:d>
+                        <m:dPr>
+                          <m:begChr m:val="("/>
+                          <m:endChr m:val=")"/>
+                        </m:dPr>
+                        <m:e>
+                          <m:r>
+                            <w:rPr>
+                              <w:rFonts w:ascii="Cambria Math" w:hAnsi="Cambria Math"/>
+                            </w:rPr>
+                            <m:t xml:space="preserve">x</m:t>
+                          </m:r>
+                        </m:e>
+                      </m:d>
+                    </m:e>
+                  </m:d>
+                </m:e>
+                <m:sup>
+                  <m:r>
+                    <w:rPr>
+                      <w:rFonts w:ascii="Cambria Math" w:hAnsi="Cambria Math"/>
+                    </w:rPr>
+                    <m:t xml:space="preserve">2</m:t>
+                  </m:r>
+                </m:sup>
+              </m:sSup>
+            </m:den>
+          </m:f>
+          <m:r>
+            <w:rPr>
+              <w:rFonts w:ascii="Cambria Math" w:hAnsi="Cambria Math"/>
+            </w:rPr>
+            <m:t xml:space="preserve">−</m:t>
+          </m:r>
+          <m:r>
+            <w:rPr>
+              <w:rFonts w:ascii="Cambria Math" w:hAnsi="Cambria Math"/>
+            </w:rPr>
+            <m:t xml:space="preserve">1</m:t>
+          </m:r>
+        </m:oMath>
+      </m:oMathPara>
+    </w:p>
+    <w:p>
+      <w:pPr>
+        <w:pStyle w:val="BodyText"/>
+        <w:spacing w:lineRule="auto" w:line="360" w:before="0" w:after="283"/>
+        <w:jc w:val="both"/>
+        <w:rPr>
+          <w:rFonts w:ascii="Times New Roman" w:hAnsi="Times New Roman"/>
+          <w:b w:val="false"/>
+          <w:bCs w:val="false"/>
+        </w:rPr>
+      </w:pPr>
+      <w:r>
+        <w:rPr>
+          <w:rFonts w:ascii="Times New Roman" w:hAnsi="Times New Roman"/>
+          <w:b w:val="false"/>
+          <w:bCs w:val="false"/>
+        </w:rPr>
+        <w:t>Упрощая числитель:</w:t>
+      </w:r>
+    </w:p>
+    <w:p>
+      <w:pPr>
+        <w:pStyle w:val="BodyText"/>
+        <w:spacing w:lineRule="auto" w:line="360" w:before="0" w:after="283"/>
+        <w:ind w:hanging="0" w:left="0" w:right="0"/>
+        <w:jc w:val="both"/>
+        <w:rPr>
+          <w:rFonts w:ascii="Times New Roman" w:hAnsi="Times New Roman"/>
+          <w:b w:val="false"/>
+          <w:bCs w:val="false"/>
+        </w:rPr>
+      </w:pPr>
+      <w:r>
+        <w:rPr>
+          <w:rFonts w:ascii="Times New Roman" w:hAnsi="Times New Roman"/>
+          <w:b w:val="false"/>
+          <w:bCs w:val="false"/>
+        </w:rPr>
+      </w:r>
+      <m:oMathPara xmlns:m="http://schemas.openxmlformats.org/officeDocument/2006/math">
+        <m:oMathParaPr>
+          <m:jc m:val="left"/>
+        </m:oMathParaPr>
+        <m:oMath>
+          <m:r>
+            <w:rPr>
+              <w:rFonts w:ascii="Cambria Math" w:hAnsi="Cambria Math"/>
+            </w:rPr>
+            <m:t xml:space="preserve">f</m:t>
+          </m:r>
+          <m:r>
+            <w:rPr>
+              <w:rFonts w:ascii="Cambria Math" w:hAnsi="Cambria Math"/>
+            </w:rPr>
+            <m:t xml:space="preserve">′</m:t>
+          </m:r>
+          <m:d>
+            <m:dPr>
+              <m:begChr m:val="("/>
+              <m:endChr m:val=")"/>
+            </m:dPr>
+            <m:e>
+              <m:r>
+                <w:rPr>
+                  <w:rFonts w:ascii="Cambria Math" w:hAnsi="Cambria Math"/>
+                </w:rPr>
+                <m:t xml:space="preserve">x</m:t>
+              </m:r>
+            </m:e>
+          </m:d>
+          <m:r>
+            <w:rPr>
+              <w:rFonts w:ascii="Cambria Math" w:hAnsi="Cambria Math"/>
+            </w:rPr>
+            <m:t xml:space="preserve">=</m:t>
+          </m:r>
+          <m:f>
+            <m:num>
+              <m:r>
+                <w:rPr>
+                  <w:rFonts w:ascii="Cambria Math" w:hAnsi="Cambria Math"/>
+                </w:rPr>
+                <m:t xml:space="preserve">−</m:t>
+              </m:r>
+              <m:r>
+                <w:rPr>
+                  <w:rFonts w:ascii="Cambria Math" w:hAnsi="Cambria Math"/>
+                </w:rPr>
+                <m:t xml:space="preserve">3</m:t>
+              </m:r>
+              <m:r>
+                <w:rPr>
+                  <w:rFonts w:ascii="Cambria Math" w:hAnsi="Cambria Math"/>
+                </w:rPr>
+                <m:t xml:space="preserve">sin</m:t>
+              </m:r>
+              <m:d>
+                <m:dPr>
+                  <m:begChr m:val="("/>
+                  <m:endChr m:val=")"/>
+                </m:dPr>
+                <m:e>
+                  <m:r>
+                    <w:rPr>
+                      <w:rFonts w:ascii="Cambria Math" w:hAnsi="Cambria Math"/>
+                    </w:rPr>
+                    <m:t xml:space="preserve">x</m:t>
+                  </m:r>
+                </m:e>
+              </m:d>
+              <m:r>
+                <w:rPr>
+                  <w:rFonts w:ascii="Cambria Math" w:hAnsi="Cambria Math"/>
+                </w:rPr>
+                <m:t xml:space="preserve">+</m:t>
+              </m:r>
+              <m:sSup>
+                <m:e>
+                  <m:r>
+                    <w:rPr>
+                      <w:rFonts w:ascii="Cambria Math" w:hAnsi="Cambria Math"/>
+                    </w:rPr>
+                    <m:t xml:space="preserve">sin</m:t>
+                  </m:r>
+                </m:e>
+                <m:sup>
+                  <m:r>
+                    <w:rPr>
+                      <w:rFonts w:ascii="Cambria Math" w:hAnsi="Cambria Math"/>
+                    </w:rPr>
+                    <m:t xml:space="preserve">2</m:t>
+                  </m:r>
+                </m:sup>
+              </m:sSup>
+              <m:d>
+                <m:dPr>
+                  <m:begChr m:val="("/>
+                  <m:endChr m:val=")"/>
+                </m:dPr>
+                <m:e>
+                  <m:r>
+                    <w:rPr>
+                      <w:rFonts w:ascii="Cambria Math" w:hAnsi="Cambria Math"/>
+                    </w:rPr>
+                    <m:t xml:space="preserve">x</m:t>
+                  </m:r>
+                </m:e>
+              </m:d>
+              <m:r>
+                <w:rPr>
+                  <w:rFonts w:ascii="Cambria Math" w:hAnsi="Cambria Math"/>
+                </w:rPr>
+                <m:t xml:space="preserve">+</m:t>
+              </m:r>
+              <m:r>
+                <w:rPr>
+                  <w:rFonts w:ascii="Cambria Math" w:hAnsi="Cambria Math"/>
+                </w:rPr>
+                <m:t xml:space="preserve">cos</m:t>
+              </m:r>
+              <m:d>
+                <m:dPr>
+                  <m:begChr m:val="("/>
+                  <m:endChr m:val=")"/>
+                </m:dPr>
+                <m:e>
+                  <m:r>
+                    <w:rPr>
+                      <w:rFonts w:ascii="Cambria Math" w:hAnsi="Cambria Math"/>
+                    </w:rPr>
+                    <m:t xml:space="preserve">x</m:t>
+                  </m:r>
+                </m:e>
+              </m:d>
+              <m:r>
+                <w:rPr>
+                  <w:rFonts w:ascii="Cambria Math" w:hAnsi="Cambria Math"/>
+                </w:rPr>
+                <m:t xml:space="preserve">+</m:t>
+              </m:r>
+              <m:sSup>
+                <m:e>
+                  <m:r>
+                    <w:rPr>
+                      <w:rFonts w:ascii="Cambria Math" w:hAnsi="Cambria Math"/>
+                    </w:rPr>
+                    <m:t xml:space="preserve">cos</m:t>
+                  </m:r>
+                </m:e>
+                <m:sup>
+                  <m:r>
+                    <w:rPr>
+                      <w:rFonts w:ascii="Cambria Math" w:hAnsi="Cambria Math"/>
+                    </w:rPr>
+                    <m:t xml:space="preserve">2</m:t>
+                  </m:r>
+                </m:sup>
+              </m:sSup>
+              <m:d>
+                <m:dPr>
+                  <m:begChr m:val="("/>
+                  <m:endChr m:val=")"/>
+                </m:dPr>
+                <m:e>
+                  <m:r>
+                    <w:rPr>
+                      <w:rFonts w:ascii="Cambria Math" w:hAnsi="Cambria Math"/>
+                    </w:rPr>
+                    <m:t xml:space="preserve">x</m:t>
+                  </m:r>
+                </m:e>
+              </m:d>
+            </m:num>
+            <m:den>
+              <m:sSup>
+                <m:e>
+                  <m:d>
+                    <m:dPr>
+                      <m:begChr m:val="("/>
+                      <m:endChr m:val=")"/>
+                    </m:dPr>
+                    <m:e>
+                      <m:r>
+                        <w:rPr>
+                          <w:rFonts w:ascii="Cambria Math" w:hAnsi="Cambria Math"/>
+                        </w:rPr>
+                        <m:t xml:space="preserve">3</m:t>
+                      </m:r>
+                      <m:r>
+                        <w:rPr>
+                          <w:rFonts w:ascii="Cambria Math" w:hAnsi="Cambria Math"/>
+                        </w:rPr>
+                        <m:t xml:space="preserve">−</m:t>
+                      </m:r>
+                      <m:r>
+                        <w:rPr>
+                          <w:rFonts w:ascii="Cambria Math" w:hAnsi="Cambria Math"/>
+                        </w:rPr>
+                        <m:t xml:space="preserve">sin</m:t>
+                      </m:r>
+                      <m:d>
+                        <m:dPr>
+                          <m:begChr m:val="("/>
+                          <m:endChr m:val=")"/>
+                        </m:dPr>
+                        <m:e>
+                          <m:r>
+                            <w:rPr>
+                              <w:rFonts w:ascii="Cambria Math" w:hAnsi="Cambria Math"/>
+                            </w:rPr>
+                            <m:t xml:space="preserve">x</m:t>
+                          </m:r>
+                        </m:e>
+                      </m:d>
+                    </m:e>
+                  </m:d>
+                </m:e>
+                <m:sup>
+                  <m:r>
+                    <w:rPr>
+                      <w:rFonts w:ascii="Cambria Math" w:hAnsi="Cambria Math"/>
+                    </w:rPr>
+                    <m:t xml:space="preserve">2</m:t>
+                  </m:r>
+                </m:sup>
+              </m:sSup>
+            </m:den>
+          </m:f>
+          <m:r>
+            <w:rPr>
+              <w:rFonts w:ascii="Cambria Math" w:hAnsi="Cambria Math"/>
+            </w:rPr>
+            <m:t xml:space="preserve">−</m:t>
+          </m:r>
+          <m:r>
+            <w:rPr>
+              <w:rFonts w:ascii="Cambria Math" w:hAnsi="Cambria Math"/>
+            </w:rPr>
+            <m:t xml:space="preserve">1</m:t>
+          </m:r>
+          <m:r>
+            <w:rPr>
+              <w:rFonts w:ascii="Cambria Math" w:hAnsi="Cambria Math"/>
+            </w:rPr>
+            <m:t xml:space="preserve">=</m:t>
+          </m:r>
+          <m:f>
+            <m:num>
+              <m:r>
+                <w:rPr>
+                  <w:rFonts w:ascii="Cambria Math" w:hAnsi="Cambria Math"/>
+                </w:rPr>
+                <m:t xml:space="preserve">1</m:t>
+              </m:r>
+              <m:r>
+                <w:rPr>
+                  <w:rFonts w:ascii="Cambria Math" w:hAnsi="Cambria Math"/>
+                </w:rPr>
+                <m:t xml:space="preserve">+</m:t>
+              </m:r>
+              <m:r>
+                <w:rPr>
+                  <w:rFonts w:ascii="Cambria Math" w:hAnsi="Cambria Math"/>
+                </w:rPr>
+                <m:t xml:space="preserve">cos</m:t>
+              </m:r>
+              <m:d>
+                <m:dPr>
+                  <m:begChr m:val="("/>
+                  <m:endChr m:val=")"/>
+                </m:dPr>
+                <m:e>
+                  <m:r>
+                    <w:rPr>
+                      <w:rFonts w:ascii="Cambria Math" w:hAnsi="Cambria Math"/>
+                    </w:rPr>
+                    <m:t xml:space="preserve">x</m:t>
+                  </m:r>
+                </m:e>
+              </m:d>
+              <m:r>
+                <w:rPr>
+                  <w:rFonts w:ascii="Cambria Math" w:hAnsi="Cambria Math"/>
+                </w:rPr>
+                <m:t xml:space="preserve">−</m:t>
+              </m:r>
+              <m:r>
+                <w:rPr>
+                  <w:rFonts w:ascii="Cambria Math" w:hAnsi="Cambria Math"/>
+                </w:rPr>
+                <m:t xml:space="preserve">3</m:t>
+              </m:r>
+              <m:r>
+                <w:rPr>
+                  <w:rFonts w:ascii="Cambria Math" w:hAnsi="Cambria Math"/>
+                </w:rPr>
+                <m:t xml:space="preserve">sin</m:t>
+              </m:r>
+              <m:d>
+                <m:dPr>
+                  <m:begChr m:val="("/>
+                  <m:endChr m:val=")"/>
+                </m:dPr>
+                <m:e>
+                  <m:r>
+                    <w:rPr>
+                      <w:rFonts w:ascii="Cambria Math" w:hAnsi="Cambria Math"/>
+                    </w:rPr>
+                    <m:t xml:space="preserve">x</m:t>
+                  </m:r>
+                </m:e>
+              </m:d>
+            </m:num>
+            <m:den>
+              <m:sSup>
+                <m:e>
+                  <m:d>
+                    <m:dPr>
+                      <m:begChr m:val="("/>
+                      <m:endChr m:val=")"/>
+                    </m:dPr>
+                    <m:e>
+                      <m:r>
+                        <w:rPr>
+                          <w:rFonts w:ascii="Cambria Math" w:hAnsi="Cambria Math"/>
+                        </w:rPr>
+                        <m:t xml:space="preserve">3</m:t>
+                      </m:r>
+                      <m:r>
+                        <w:rPr>
+                          <w:rFonts w:ascii="Cambria Math" w:hAnsi="Cambria Math"/>
+                        </w:rPr>
+                        <m:t xml:space="preserve">−</m:t>
+                      </m:r>
+                      <m:r>
+                        <w:rPr>
+                          <w:rFonts w:ascii="Cambria Math" w:hAnsi="Cambria Math"/>
+                        </w:rPr>
+                        <m:t xml:space="preserve">sin</m:t>
+                      </m:r>
+                      <m:d>
+                        <m:dPr>
+                          <m:begChr m:val="("/>
+                          <m:endChr m:val=")"/>
+                        </m:dPr>
+                        <m:e>
+                          <m:r>
+                            <w:rPr>
+                              <w:rFonts w:ascii="Cambria Math" w:hAnsi="Cambria Math"/>
+                            </w:rPr>
+                            <m:t xml:space="preserve">x</m:t>
+                          </m:r>
+                        </m:e>
+                      </m:d>
+                    </m:e>
+                  </m:d>
+                </m:e>
+                <m:sup>
+                  <m:r>
+                    <w:rPr>
+                      <w:rFonts w:ascii="Cambria Math" w:hAnsi="Cambria Math"/>
+                    </w:rPr>
+                    <m:t xml:space="preserve">2</m:t>
+                  </m:r>
+                </m:sup>
+              </m:sSup>
+            </m:den>
+          </m:f>
+          <m:r>
+            <w:rPr>
+              <w:rFonts w:ascii="Cambria Math" w:hAnsi="Cambria Math"/>
+            </w:rPr>
+            <m:t xml:space="preserve">−</m:t>
+          </m:r>
+          <m:r>
+            <w:rPr>
+              <w:rFonts w:ascii="Cambria Math" w:hAnsi="Cambria Math"/>
+            </w:rPr>
+            <m:t xml:space="preserve">1</m:t>
+          </m:r>
+        </m:oMath>
+      </m:oMathPara>
+    </w:p>
+    <w:p>
+      <w:pPr>
+        <w:pStyle w:val="BodyText"/>
+        <w:spacing w:lineRule="auto" w:line="360" w:before="0" w:after="283"/>
+        <w:ind w:hanging="0" w:left="0" w:right="0"/>
+        <w:jc w:val="both"/>
+        <w:rPr>
+          <w:rFonts w:ascii="Times New Roman" w:hAnsi="Times New Roman"/>
+          <w:b w:val="false"/>
+          <w:bCs w:val="false"/>
+        </w:rPr>
+      </w:pPr>
+      <w:r>
+        <w:rPr>
+          <w:rFonts w:ascii="Times New Roman" w:hAnsi="Times New Roman"/>
+          <w:b w:val="false"/>
+          <w:bCs w:val="false"/>
+        </w:rPr>
+        <w:t>На интервале [0,1] значение производной f′(x) отрицательно (так как вычитаемая единица значительно больше дроби), следовательно, функция монотонно убывает.</w:t>
+      </w:r>
+    </w:p>
+    <w:p>
+      <w:pPr>
+        <w:pStyle w:val="BodyText"/>
+        <w:spacing w:lineRule="auto" w:line="360" w:before="0" w:after="283"/>
+        <w:jc w:val="both"/>
+        <w:rPr>
+          <w:rFonts w:ascii="Times New Roman" w:hAnsi="Times New Roman"/>
+          <w:b w:val="false"/>
+          <w:bCs w:val="false"/>
+        </w:rPr>
+      </w:pPr>
+      <w:r>
+        <w:rPr>
+          <w:rFonts w:ascii="Times New Roman" w:hAnsi="Times New Roman"/>
+          <w:b w:val="false"/>
+          <w:bCs w:val="false"/>
+        </w:rPr>
+        <w:t>Локализация корня:</w:t>
+      </w:r>
+    </w:p>
+    <w:p>
+      <w:pPr>
+        <w:pStyle w:val="BodyText"/>
+        <w:numPr>
+          <w:ilvl w:val="0"/>
+          <w:numId w:val="4"/>
+        </w:numPr>
+        <w:tabs>
+          <w:tab w:val="clear" w:pos="720"/>
+          <w:tab w:val="left" w:pos="0" w:leader="none"/>
+        </w:tabs>
+        <w:spacing w:lineRule="auto" w:line="360" w:before="0" w:after="283"/>
+        <w:ind w:hanging="283" w:left="709" w:right="0"/>
+        <w:jc w:val="both"/>
+        <w:rPr>
+          <w:rFonts w:ascii="Times New Roman" w:hAnsi="Times New Roman"/>
+          <w:b w:val="false"/>
+          <w:bCs w:val="false"/>
+        </w:rPr>
+      </w:pPr>
+      <w:r>
+        <w:rPr>
+          <w:rFonts w:ascii="Times New Roman" w:hAnsi="Times New Roman"/>
+          <w:b w:val="false"/>
+          <w:bCs w:val="false"/>
+        </w:rPr>
+        <w:t>При x = 0:</w:t>
+      </w:r>
+    </w:p>
+    <w:p>
+      <w:pPr>
+        <w:pStyle w:val="BodyText"/>
+        <w:numPr>
+          <w:ilvl w:val="0"/>
+          <w:numId w:val="0"/>
+        </w:numPr>
+        <w:spacing w:lineRule="auto" w:line="360"/>
+        <w:ind w:hanging="0" w:left="0" w:right="0"/>
+        <w:jc w:val="both"/>
+        <w:rPr>
+          <w:rFonts w:ascii="Times New Roman" w:hAnsi="Times New Roman"/>
+          <w:b w:val="false"/>
+          <w:bCs w:val="false"/>
+        </w:rPr>
+      </w:pPr>
+      <w:r>
+        <w:rPr>
+          <w:rFonts w:ascii="Times New Roman" w:hAnsi="Times New Roman"/>
+          <w:b w:val="false"/>
+          <w:bCs w:val="false"/>
+        </w:rPr>
+      </w:r>
+      <m:oMathPara xmlns:m="http://schemas.openxmlformats.org/officeDocument/2006/math">
+        <m:oMathParaPr>
+          <m:jc m:val="left"/>
+        </m:oMathParaPr>
+        <m:oMath>
+          <m:r>
+            <w:rPr>
+              <w:rFonts w:ascii="Cambria Math" w:hAnsi="Cambria Math"/>
+            </w:rPr>
+            <m:t xml:space="preserve">f</m:t>
+          </m:r>
+          <m:d>
+            <m:dPr>
+              <m:begChr m:val="("/>
+              <m:endChr m:val=")"/>
+            </m:dPr>
+            <m:e>
+              <m:r>
+                <w:rPr>
+                  <w:rFonts w:ascii="Cambria Math" w:hAnsi="Cambria Math"/>
+                </w:rPr>
+                <m:t xml:space="preserve">x</m:t>
+              </m:r>
+            </m:e>
+          </m:d>
+          <m:r>
+            <w:rPr>
+              <w:rFonts w:ascii="Cambria Math" w:hAnsi="Cambria Math"/>
+            </w:rPr>
+            <m:t xml:space="preserve">=</m:t>
+          </m:r>
+          <m:f>
+            <m:num>
+              <m:r>
+                <w:rPr>
+                  <w:rFonts w:ascii="Cambria Math" w:hAnsi="Cambria Math"/>
+                </w:rPr>
+                <m:t xml:space="preserve">1</m:t>
+              </m:r>
+              <m:r>
+                <w:rPr>
+                  <w:rFonts w:ascii="Cambria Math" w:hAnsi="Cambria Math"/>
+                </w:rPr>
+                <m:t xml:space="preserve">+</m:t>
+              </m:r>
+              <m:r>
+                <w:rPr>
+                  <w:rFonts w:ascii="Cambria Math" w:hAnsi="Cambria Math"/>
+                </w:rPr>
+                <m:t xml:space="preserve">cos</m:t>
+              </m:r>
+              <m:d>
+                <m:dPr>
+                  <m:begChr m:val="("/>
+                  <m:endChr m:val=")"/>
+                </m:dPr>
+                <m:e>
+                  <m:r>
+                    <w:rPr>
+                      <w:rFonts w:ascii="Cambria Math" w:hAnsi="Cambria Math"/>
+                    </w:rPr>
+                    <m:t xml:space="preserve">0</m:t>
+                  </m:r>
+                </m:e>
+              </m:d>
+            </m:num>
+            <m:den>
+              <m:r>
+                <w:rPr>
+                  <w:rFonts w:ascii="Cambria Math" w:hAnsi="Cambria Math"/>
+                </w:rPr>
+                <m:t xml:space="preserve">3</m:t>
+              </m:r>
+              <m:r>
+                <w:rPr>
+                  <w:rFonts w:ascii="Cambria Math" w:hAnsi="Cambria Math"/>
+                </w:rPr>
+                <m:t xml:space="preserve">−</m:t>
+              </m:r>
+              <m:r>
+                <w:rPr>
+                  <w:rFonts w:ascii="Cambria Math" w:hAnsi="Cambria Math"/>
+                </w:rPr>
+                <m:t xml:space="preserve">sin</m:t>
+              </m:r>
+              <m:d>
+                <m:dPr>
+                  <m:begChr m:val="("/>
+                  <m:endChr m:val=")"/>
+                </m:dPr>
+                <m:e>
+                  <m:r>
+                    <w:rPr>
+                      <w:rFonts w:ascii="Cambria Math" w:hAnsi="Cambria Math"/>
+                    </w:rPr>
+                    <m:t xml:space="preserve">0</m:t>
+                  </m:r>
+                </m:e>
+              </m:d>
+            </m:den>
+          </m:f>
+          <m:r>
+            <w:rPr>
+              <w:rFonts w:ascii="Cambria Math" w:hAnsi="Cambria Math"/>
+            </w:rPr>
+            <m:t xml:space="preserve">​</m:t>
+          </m:r>
+          <m:r>
+            <w:rPr>
+              <w:rFonts w:ascii="Cambria Math" w:hAnsi="Cambria Math"/>
+            </w:rPr>
+            <m:t xml:space="preserve">−</m:t>
+          </m:r>
+          <m:r>
+            <w:rPr>
+              <w:rFonts w:ascii="Cambria Math" w:hAnsi="Cambria Math"/>
+            </w:rPr>
+            <m:t xml:space="preserve">0</m:t>
+          </m:r>
+          <m:r>
+            <w:rPr>
+              <w:rFonts w:ascii="Cambria Math" w:hAnsi="Cambria Math"/>
+            </w:rPr>
+            <m:t xml:space="preserve">=</m:t>
+          </m:r>
+          <m:f>
+            <m:num>
+              <m:r>
+                <w:rPr>
+                  <w:rFonts w:ascii="Cambria Math" w:hAnsi="Cambria Math"/>
+                </w:rPr>
+                <m:t xml:space="preserve">1</m:t>
+              </m:r>
+              <m:r>
+                <w:rPr>
+                  <w:rFonts w:ascii="Cambria Math" w:hAnsi="Cambria Math"/>
+                </w:rPr>
+                <m:t xml:space="preserve">+</m:t>
+              </m:r>
+              <m:r>
+                <w:rPr>
+                  <w:rFonts w:ascii="Cambria Math" w:hAnsi="Cambria Math"/>
+                </w:rPr>
+                <m:t xml:space="preserve">1</m:t>
+              </m:r>
+            </m:num>
+            <m:den>
+              <m:r>
+                <w:rPr>
+                  <w:rFonts w:ascii="Cambria Math" w:hAnsi="Cambria Math"/>
+                </w:rPr>
+                <m:t xml:space="preserve">3</m:t>
+              </m:r>
+              <m:r>
+                <w:rPr>
+                  <w:rFonts w:ascii="Cambria Math" w:hAnsi="Cambria Math"/>
+                </w:rPr>
+                <m:t xml:space="preserve">−</m:t>
+              </m:r>
+              <m:r>
+                <w:rPr>
+                  <w:rFonts w:ascii="Cambria Math" w:hAnsi="Cambria Math"/>
+                </w:rPr>
+                <m:t xml:space="preserve">0</m:t>
+              </m:r>
+            </m:den>
+          </m:f>
+          <m:r>
+            <w:rPr>
+              <w:rFonts w:ascii="Cambria Math" w:hAnsi="Cambria Math"/>
+            </w:rPr>
+            <m:t xml:space="preserve">=</m:t>
+          </m:r>
+          <m:f>
+            <m:num>
+              <m:r>
+                <w:rPr>
+                  <w:rFonts w:ascii="Cambria Math" w:hAnsi="Cambria Math"/>
+                </w:rPr>
+                <m:t xml:space="preserve">2</m:t>
+              </m:r>
+            </m:num>
+            <m:den>
+              <m:r>
+                <w:rPr>
+                  <w:rFonts w:ascii="Cambria Math" w:hAnsi="Cambria Math"/>
+                </w:rPr>
+                <m:t xml:space="preserve">3</m:t>
+              </m:r>
+            </m:den>
+          </m:f>
+          <m:r>
+            <w:rPr>
+              <w:rFonts w:ascii="Cambria Math" w:hAnsi="Cambria Math"/>
+            </w:rPr>
+            <m:t xml:space="preserve">≈</m:t>
+          </m:r>
+          <m:r>
+            <w:rPr>
+              <w:rFonts w:ascii="Cambria Math" w:hAnsi="Cambria Math"/>
+            </w:rPr>
+            <m:t xml:space="preserve">0.667</m:t>
+          </m:r>
+          <m:r>
+            <w:rPr>
+              <w:rFonts w:ascii="Cambria Math" w:hAnsi="Cambria Math"/>
+            </w:rPr>
+            <m:t xml:space="preserve">&gt;</m:t>
+          </m:r>
+          <m:r>
+            <w:rPr>
+              <w:rFonts w:ascii="Cambria Math" w:hAnsi="Cambria Math"/>
+            </w:rPr>
+            <m:t xml:space="preserve">0</m:t>
+          </m:r>
+        </m:oMath>
+      </m:oMathPara>
+    </w:p>
+    <w:p>
+      <w:pPr>
+        <w:pStyle w:val="BodyText"/>
+        <w:numPr>
+          <w:ilvl w:val="0"/>
+          <w:numId w:val="4"/>
+        </w:numPr>
+        <w:tabs>
+          <w:tab w:val="clear" w:pos="720"/>
+          <w:tab w:val="left" w:pos="0" w:leader="none"/>
+        </w:tabs>
+        <w:spacing w:lineRule="auto" w:line="360" w:before="0" w:after="283"/>
+        <w:ind w:hanging="283" w:left="709" w:right="0"/>
+        <w:jc w:val="both"/>
+        <w:rPr>
+          <w:rFonts w:ascii="Times New Roman" w:hAnsi="Times New Roman"/>
+          <w:b w:val="false"/>
+          <w:bCs w:val="false"/>
+        </w:rPr>
+      </w:pPr>
+      <w:r>
+        <w:rPr>
+          <w:rFonts w:ascii="Times New Roman" w:hAnsi="Times New Roman"/>
+          <w:b w:val="false"/>
+          <w:bCs w:val="false"/>
+        </w:rPr>
+        <w:t>При x = 1:</w:t>
+      </w:r>
+    </w:p>
+    <w:p>
+      <w:pPr>
+        <w:pStyle w:val="BodyText"/>
+        <w:numPr>
+          <w:ilvl w:val="0"/>
+          <w:numId w:val="0"/>
+        </w:numPr>
+        <w:spacing w:lineRule="auto" w:line="360" w:before="0" w:after="283"/>
+        <w:ind w:hanging="0" w:left="0" w:right="0"/>
+        <w:jc w:val="both"/>
+        <w:rPr>
+          <w:rFonts w:ascii="Times New Roman" w:hAnsi="Times New Roman"/>
+          <w:b w:val="false"/>
+          <w:bCs w:val="false"/>
+        </w:rPr>
+      </w:pPr>
+      <w:r>
+        <w:rPr>
+          <w:rFonts w:ascii="Times New Roman" w:hAnsi="Times New Roman"/>
+          <w:b w:val="false"/>
+          <w:bCs w:val="false"/>
+        </w:rPr>
+      </w:r>
+      <m:oMathPara xmlns:m="http://schemas.openxmlformats.org/officeDocument/2006/math">
+        <m:oMathParaPr>
+          <m:jc m:val="left"/>
+        </m:oMathParaPr>
+        <m:oMath>
+          <m:r>
+            <w:rPr>
+              <w:rFonts w:ascii="Cambria Math" w:hAnsi="Cambria Math"/>
+            </w:rPr>
+            <m:t xml:space="preserve">f</m:t>
+          </m:r>
+          <m:d>
+            <m:dPr>
+              <m:begChr m:val="("/>
+              <m:endChr m:val=")"/>
+            </m:dPr>
+            <m:e>
+              <m:r>
+                <w:rPr>
+                  <w:rFonts w:ascii="Cambria Math" w:hAnsi="Cambria Math"/>
+                </w:rPr>
+                <m:t xml:space="preserve">x</m:t>
+              </m:r>
+            </m:e>
+          </m:d>
+          <m:r>
+            <w:rPr>
+              <w:rFonts w:ascii="Cambria Math" w:hAnsi="Cambria Math"/>
+            </w:rPr>
+            <m:t xml:space="preserve">=</m:t>
+          </m:r>
+          <m:f>
+            <m:num>
+              <m:r>
+                <w:rPr>
+                  <w:rFonts w:ascii="Cambria Math" w:hAnsi="Cambria Math"/>
+                </w:rPr>
+                <m:t xml:space="preserve">1</m:t>
+              </m:r>
+              <m:r>
+                <w:rPr>
+                  <w:rFonts w:ascii="Cambria Math" w:hAnsi="Cambria Math"/>
+                </w:rPr>
+                <m:t xml:space="preserve">+</m:t>
+              </m:r>
+              <m:r>
+                <w:rPr>
+                  <w:rFonts w:ascii="Cambria Math" w:hAnsi="Cambria Math"/>
+                </w:rPr>
+                <m:t xml:space="preserve">cos</m:t>
+              </m:r>
+              <m:d>
+                <m:dPr>
+                  <m:begChr m:val="("/>
+                  <m:endChr m:val=")"/>
+                </m:dPr>
+                <m:e>
+                  <m:r>
+                    <w:rPr>
+                      <w:rFonts w:ascii="Cambria Math" w:hAnsi="Cambria Math"/>
+                    </w:rPr>
+                    <m:t xml:space="preserve">1</m:t>
+                  </m:r>
+                </m:e>
+              </m:d>
+            </m:num>
+            <m:den>
+              <m:r>
+                <w:rPr>
+                  <w:rFonts w:ascii="Cambria Math" w:hAnsi="Cambria Math"/>
+                </w:rPr>
+                <m:t xml:space="preserve">3</m:t>
+              </m:r>
+              <m:r>
+                <w:rPr>
+                  <w:rFonts w:ascii="Cambria Math" w:hAnsi="Cambria Math"/>
+                </w:rPr>
+                <m:t xml:space="preserve">−</m:t>
+              </m:r>
+              <m:r>
+                <w:rPr>
+                  <w:rFonts w:ascii="Cambria Math" w:hAnsi="Cambria Math"/>
+                </w:rPr>
+                <m:t xml:space="preserve">sin</m:t>
+              </m:r>
+              <m:d>
+                <m:dPr>
+                  <m:begChr m:val="("/>
+                  <m:endChr m:val=")"/>
+                </m:dPr>
+                <m:e>
+                  <m:r>
+                    <w:rPr>
+                      <w:rFonts w:ascii="Cambria Math" w:hAnsi="Cambria Math"/>
+                    </w:rPr>
+                    <m:t xml:space="preserve">1</m:t>
+                  </m:r>
+                </m:e>
+              </m:d>
+            </m:den>
+          </m:f>
+          <m:r>
+            <w:rPr>
+              <w:rFonts w:ascii="Cambria Math" w:hAnsi="Cambria Math"/>
+            </w:rPr>
+            <m:t xml:space="preserve">​</m:t>
+          </m:r>
+          <m:r>
+            <w:rPr>
+              <w:rFonts w:ascii="Cambria Math" w:hAnsi="Cambria Math"/>
+            </w:rPr>
+            <m:t xml:space="preserve">−</m:t>
+          </m:r>
+          <m:r>
+            <w:rPr>
+              <w:rFonts w:ascii="Cambria Math" w:hAnsi="Cambria Math"/>
+            </w:rPr>
+            <m:t xml:space="preserve">1</m:t>
+          </m:r>
+          <m:r>
+            <w:rPr>
+              <w:rFonts w:ascii="Cambria Math" w:hAnsi="Cambria Math"/>
+            </w:rPr>
+            <m:t xml:space="preserve">≈</m:t>
+          </m:r>
+          <m:f>
+            <m:num>
+              <m:r>
+                <w:rPr>
+                  <w:rFonts w:ascii="Cambria Math" w:hAnsi="Cambria Math"/>
+                </w:rPr>
+                <m:t xml:space="preserve">1</m:t>
+              </m:r>
+              <m:r>
+                <w:rPr>
+                  <w:rFonts w:ascii="Cambria Math" w:hAnsi="Cambria Math"/>
+                </w:rPr>
+                <m:t xml:space="preserve">+</m:t>
+              </m:r>
+              <m:r>
+                <w:rPr>
+                  <w:rFonts w:ascii="Cambria Math" w:hAnsi="Cambria Math"/>
+                </w:rPr>
+                <m:t xml:space="preserve">0.540</m:t>
+              </m:r>
+            </m:num>
+            <m:den>
+              <m:r>
+                <w:rPr>
+                  <w:rFonts w:ascii="Cambria Math" w:hAnsi="Cambria Math"/>
+                </w:rPr>
+                <m:t xml:space="preserve">3</m:t>
+              </m:r>
+              <m:r>
+                <w:rPr>
+                  <w:rFonts w:ascii="Cambria Math" w:hAnsi="Cambria Math"/>
+                </w:rPr>
+                <m:t xml:space="preserve">−</m:t>
+              </m:r>
+              <m:r>
+                <w:rPr>
+                  <w:rFonts w:ascii="Cambria Math" w:hAnsi="Cambria Math"/>
+                </w:rPr>
+                <m:t xml:space="preserve">0.841</m:t>
+              </m:r>
+            </m:den>
+          </m:f>
+          <m:r>
+            <w:rPr>
+              <w:rFonts w:ascii="Cambria Math" w:hAnsi="Cambria Math"/>
+            </w:rPr>
+            <m:t xml:space="preserve">−</m:t>
+          </m:r>
+          <m:r>
+            <w:rPr>
+              <w:rFonts w:ascii="Cambria Math" w:hAnsi="Cambria Math"/>
+            </w:rPr>
+            <m:t xml:space="preserve">1</m:t>
+          </m:r>
+          <m:r>
+            <w:rPr>
+              <w:rFonts w:ascii="Cambria Math" w:hAnsi="Cambria Math"/>
+            </w:rPr>
+            <m:t xml:space="preserve">≈</m:t>
+          </m:r>
+          <m:r>
+            <w:rPr>
+              <w:rFonts w:ascii="Cambria Math" w:hAnsi="Cambria Math"/>
+            </w:rPr>
+            <m:t xml:space="preserve">−</m:t>
+          </m:r>
+          <m:r>
+            <w:rPr>
+              <w:rFonts w:ascii="Cambria Math" w:hAnsi="Cambria Math"/>
+            </w:rPr>
+            <m:t xml:space="preserve">0.287</m:t>
+          </m:r>
+          <m:r>
+            <w:rPr>
+              <w:rFonts w:ascii="Cambria Math" w:hAnsi="Cambria Math"/>
+            </w:rPr>
+            <m:t xml:space="preserve">&lt;</m:t>
+          </m:r>
+          <m:r>
+            <w:rPr>
+              <w:rFonts w:ascii="Cambria Math" w:hAnsi="Cambria Math"/>
+            </w:rPr>
+            <m:t xml:space="preserve">0</m:t>
+          </m:r>
+        </m:oMath>
+      </m:oMathPara>
+    </w:p>
+    <w:p>
+      <w:pPr>
+        <w:pStyle w:val="BodyText"/>
+        <w:spacing w:lineRule="auto" w:line="360" w:before="0" w:after="283"/>
+        <w:ind w:hanging="0" w:left="0" w:right="0"/>
+        <w:jc w:val="both"/>
+        <w:rPr>
+          <w:rFonts w:ascii="Times New Roman" w:hAnsi="Times New Roman"/>
+          <w:b w:val="false"/>
+          <w:bCs w:val="false"/>
+        </w:rPr>
+      </w:pPr>
+      <w:r>
+        <w:rPr>
+          <w:rFonts w:ascii="Times New Roman" w:hAnsi="Times New Roman"/>
+          <w:b w:val="false"/>
+          <w:bCs w:val="false"/>
+        </w:rPr>
+        <w:t>Функция непрерывна на отрезке [0,1] и на его концах принимает значения разных знаков. По теореме Больцано-Коши корень существует. Так как функция строго убывает на этом интервале, корень единственный.</w:t>
+      </w:r>
+    </w:p>
+    <w:p>
+      <w:pPr>
+        <w:pStyle w:val="BodyText"/>
+        <w:spacing w:lineRule="auto" w:line="360" w:before="0" w:after="283"/>
+        <w:ind w:hanging="0" w:left="0" w:right="0"/>
+        <w:jc w:val="both"/>
+        <w:rPr>
+          <w:rFonts w:ascii="Times New Roman" w:hAnsi="Times New Roman"/>
+          <w:b w:val="false"/>
+          <w:bCs w:val="false"/>
+        </w:rPr>
+      </w:pPr>
+      <w:r>
+        <w:rPr>
+          <w:rFonts w:ascii="Times New Roman" w:hAnsi="Times New Roman"/>
+          <w:b w:val="false"/>
+          <w:bCs w:val="false"/>
+        </w:rPr>
+        <w:t xml:space="preserve">Для метода </w:t>
+      </w:r>
+      <w:r>
+        <w:rPr>
+          <w:rFonts w:ascii="Times New Roman" w:hAnsi="Times New Roman"/>
+          <w:b w:val="false"/>
+          <w:bCs w:val="false"/>
+        </w:rPr>
+        <w:t>Бисекции</w:t>
+      </w:r>
+      <w:r>
+        <w:rPr>
+          <w:rFonts w:ascii="Times New Roman" w:hAnsi="Times New Roman"/>
+          <w:b w:val="false"/>
+          <w:bCs w:val="false"/>
+        </w:rPr>
+        <w:t xml:space="preserve"> выбран отрезок [0,1]. Эти рассуждения подтверждаются графически: график пересекает ось Ox именно на этом промежутке.</w:t>
+      </w:r>
+    </w:p>
+    <w:p>
+      <w:pPr>
+        <w:pStyle w:val="Normal"/>
+        <w:numPr>
+          <w:ilvl w:val="0"/>
+          <w:numId w:val="0"/>
+        </w:numPr>
+        <w:spacing w:lineRule="auto" w:line="360"/>
+        <w:ind w:hanging="0" w:left="0"/>
+        <w:jc w:val="both"/>
+        <w:rPr>
+          <w:rFonts w:ascii="Times New Roman" w:hAnsi="Times New Roman"/>
+          <w:sz w:val="28"/>
+          <w:szCs w:val="28"/>
+        </w:rPr>
+      </w:pPr>
+      <w:r>
+        <w:rPr/>
+      </w:r>
       <w:bookmarkStart w:id="6" w:name="__RefHeading___Toc2758_1216119672"/>
-      <w:bookmarkEnd w:id="6"/>
-      <w:r>
-        <w:rPr>
-          <w:sz w:val="28"/>
-          <w:szCs w:val="28"/>
-        </w:rPr>
-        <w:t>Было выбрано нелинейное уравнение f(x) = (1.0 + cos(x))/(3.0 - sin(x)) - x=0. Предварительно был произведен графический анализ функции для локализации корня на отрезке [0,1], где функция непрерывна и удовлетворяет условию теоремы Коши (f(0)⋅f(1)&lt;0).</w:t>
-      </w:r>
-    </w:p>
-    <w:p>
-      <w:pPr>
-        <w:pStyle w:val="Normal"/>
-        <w:spacing w:lineRule="auto" w:line="360"/>
+      <w:bookmarkStart w:id="7" w:name="__RefHeading___Toc2758_1216119672"/>
+      <w:bookmarkEnd w:id="7"/>
+    </w:p>
+    <w:p>
+      <w:pPr>
+        <w:pStyle w:val="Normal"/>
+        <w:tabs>
+          <w:tab w:val="clear" w:pos="720"/>
+          <w:tab w:val="left" w:pos="0" w:leader="none"/>
+        </w:tabs>
+        <w:spacing w:lineRule="auto" w:line="360"/>
+        <w:ind w:hanging="0" w:left="709"/>
         <w:jc w:val="both"/>
         <w:rPr>
           <w:rFonts w:ascii="Times New Roman" w:hAnsi="Times New Roman"/>
@@ -3009,10 +4613,6 @@
         </w:rPr>
       </w:pPr>
       <w:r>
-        <w:rPr>
-          <w:sz w:val="28"/>
-          <w:szCs w:val="28"/>
-        </w:rPr>
         <w:drawing>
           <wp:anchor behindDoc="0" distT="0" distB="0" distL="0" distR="0" simplePos="0" locked="0" layoutInCell="0" allowOverlap="1" relativeHeight="2">
             <wp:simplePos x="0" y="0"/>
@@ -3059,6 +4659,37 @@
           </wp:anchor>
         </w:drawing>
       </w:r>
+      <w:r>
+        <w:rPr>
+          <w:sz w:val="28"/>
+          <w:szCs w:val="28"/>
+        </w:rPr>
+        <w:t xml:space="preserve"> </w:t>
+      </w:r>
+    </w:p>
+    <w:p>
+      <w:pPr>
+        <w:pStyle w:val="Normal"/>
+        <w:numPr>
+          <w:ilvl w:val="0"/>
+          <w:numId w:val="0"/>
+        </w:numPr>
+        <w:tabs>
+          <w:tab w:val="clear" w:pos="720"/>
+          <w:tab w:val="left" w:pos="0" w:leader="none"/>
+        </w:tabs>
+        <w:spacing w:lineRule="auto" w:line="360"/>
+        <w:ind w:hanging="0" w:left="709"/>
+        <w:jc w:val="both"/>
+        <w:rPr>
+          <w:rFonts w:ascii="Times New Roman" w:hAnsi="Times New Roman"/>
+          <w:sz w:val="28"/>
+          <w:szCs w:val="28"/>
+        </w:rPr>
+      </w:pPr>
+      <w:r>
+        <w:rPr/>
+      </w:r>
     </w:p>
     <w:p>
       <w:pPr>
@@ -3080,8 +4711,8 @@
           <w:szCs w:val="28"/>
         </w:rPr>
       </w:pPr>
-      <w:bookmarkStart w:id="7" w:name="__RefHeading___Toc2760_1216119672"/>
-      <w:bookmarkEnd w:id="7"/>
+      <w:bookmarkStart w:id="8" w:name="__RefHeading___Toc2760_1216119672"/>
+      <w:bookmarkEnd w:id="8"/>
       <w:r>
         <w:rPr>
           <w:sz w:val="28"/>
@@ -3106,11 +4737,12 @@
         <w:jc w:val="both"/>
         <w:rPr/>
       </w:pPr>
-      <w:bookmarkStart w:id="8" w:name="__RefHeading___Toc2762_1216119672"/>
-      <w:bookmarkEnd w:id="8"/>
+      <w:bookmarkStart w:id="9" w:name="__RefHeading___Toc2762_1216119672"/>
+      <w:bookmarkEnd w:id="9"/>
       <w:r>
         <w:rPr>
           <w:rStyle w:val="SourceText"/>
+          <w:rFonts w:ascii="Times New Roman" w:hAnsi="Times New Roman"/>
           <w:b w:val="false"/>
           <w:bCs w:val="false"/>
           <w:sz w:val="28"/>
@@ -3144,11 +4776,12 @@
         <w:jc w:val="both"/>
         <w:rPr/>
       </w:pPr>
-      <w:bookmarkStart w:id="9" w:name="__RefHeading___Toc2764_1216119672"/>
-      <w:bookmarkEnd w:id="9"/>
+      <w:bookmarkStart w:id="10" w:name="__RefHeading___Toc2764_1216119672"/>
+      <w:bookmarkEnd w:id="10"/>
       <w:r>
         <w:rPr>
           <w:rStyle w:val="SourceText"/>
+          <w:rFonts w:ascii="Times New Roman" w:hAnsi="Times New Roman"/>
           <w:b w:val="false"/>
           <w:bCs w:val="false"/>
           <w:sz w:val="28"/>
@@ -3182,8 +4815,8 @@
           <w:szCs w:val="28"/>
         </w:rPr>
       </w:pPr>
-      <w:bookmarkStart w:id="10" w:name="__RefHeading___Toc2766_1216119672"/>
-      <w:bookmarkEnd w:id="10"/>
+      <w:bookmarkStart w:id="11" w:name="__RefHeading___Toc2766_1216119672"/>
+      <w:bookmarkEnd w:id="11"/>
       <w:r>
         <w:rPr>
           <w:sz w:val="28"/>
@@ -3208,8 +4841,8 @@
         <w:jc w:val="both"/>
         <w:rPr/>
       </w:pPr>
-      <w:bookmarkStart w:id="11" w:name="__RefHeading___Toc2768_1216119672"/>
-      <w:bookmarkEnd w:id="11"/>
+      <w:bookmarkStart w:id="12" w:name="__RefHeading___Toc2768_1216119672"/>
+      <w:bookmarkEnd w:id="12"/>
       <w:r>
         <w:rPr>
           <w:b w:val="false"/>
@@ -3259,8 +4892,8 @@
           <w:szCs w:val="28"/>
         </w:rPr>
       </w:pPr>
-      <w:bookmarkStart w:id="12" w:name="__RefHeading___Toc2770_1216119672"/>
-      <w:bookmarkEnd w:id="12"/>
+      <w:bookmarkStart w:id="13" w:name="__RefHeading___Toc2770_1216119672"/>
+      <w:bookmarkEnd w:id="13"/>
       <w:r>
         <w:rPr>
           <w:b w:val="false"/>
@@ -3291,8 +4924,8 @@
           <w:szCs w:val="28"/>
         </w:rPr>
       </w:pPr>
-      <w:bookmarkStart w:id="13" w:name="__RefHeading___Toc2772_1216119672"/>
-      <w:bookmarkEnd w:id="13"/>
+      <w:bookmarkStart w:id="14" w:name="__RefHeading___Toc2772_1216119672"/>
+      <w:bookmarkEnd w:id="14"/>
       <w:r>
         <w:rPr>
           <w:sz w:val="28"/>
@@ -3344,8 +4977,8 @@
           <w:szCs w:val="28"/>
         </w:rPr>
       </w:pPr>
-      <w:bookmarkStart w:id="14" w:name="__RefHeading___Toc2774_1216119672"/>
-      <w:bookmarkEnd w:id="14"/>
+      <w:bookmarkStart w:id="15" w:name="__RefHeading___Toc2774_1216119672"/>
+      <w:bookmarkEnd w:id="15"/>
       <w:r>
         <w:rPr>
           <w:sz w:val="28"/>
@@ -3374,8 +5007,8 @@
           <w:szCs w:val="28"/>
         </w:rPr>
       </w:pPr>
-      <w:bookmarkStart w:id="15" w:name="__RefHeading___Toc2776_1216119672"/>
-      <w:bookmarkEnd w:id="15"/>
+      <w:bookmarkStart w:id="16" w:name="__RefHeading___Toc2776_1216119672"/>
+      <w:bookmarkEnd w:id="16"/>
       <w:r>
         <w:rPr>
           <w:sz w:val="28"/>
@@ -3404,8 +5037,8 @@
           <w:szCs w:val="28"/>
         </w:rPr>
       </w:pPr>
-      <w:bookmarkStart w:id="16" w:name="__RefHeading___Toc2778_1216119672"/>
-      <w:bookmarkEnd w:id="16"/>
+      <w:bookmarkStart w:id="17" w:name="__RefHeading___Toc2778_1216119672"/>
+      <w:bookmarkEnd w:id="17"/>
       <w:r>
         <w:rPr>
           <w:sz w:val="28"/>
@@ -3430,8 +5063,8 @@
         <w:jc w:val="both"/>
         <w:rPr/>
       </w:pPr>
-      <w:bookmarkStart w:id="17" w:name="__RefHeading___Toc2780_1216119672"/>
-      <w:bookmarkEnd w:id="17"/>
+      <w:bookmarkStart w:id="18" w:name="__RefHeading___Toc2780_1216119672"/>
+      <w:bookmarkEnd w:id="18"/>
       <w:r>
         <w:rPr>
           <w:b w:val="false"/>
@@ -3527,8 +5160,8 @@
           <w:szCs w:val="28"/>
         </w:rPr>
       </w:pPr>
-      <w:bookmarkStart w:id="18" w:name="__RefHeading___Toc2782_1216119672"/>
-      <w:bookmarkEnd w:id="18"/>
+      <w:bookmarkStart w:id="19" w:name="__RefHeading___Toc2782_1216119672"/>
+      <w:bookmarkEnd w:id="19"/>
       <w:r>
         <w:rPr>
           <w:sz w:val="28"/>
@@ -3553,8 +5186,8 @@
         <w:jc w:val="both"/>
         <w:rPr/>
       </w:pPr>
-      <w:bookmarkStart w:id="19" w:name="__RefHeading___Toc2784_1216119672"/>
-      <w:bookmarkEnd w:id="19"/>
+      <w:bookmarkStart w:id="20" w:name="__RefHeading___Toc2784_1216119672"/>
+      <w:bookmarkEnd w:id="20"/>
       <w:r>
         <w:rPr>
           <w:b w:val="false"/>
@@ -3604,8 +5237,8 @@
           <w:szCs w:val="28"/>
         </w:rPr>
       </w:pPr>
-      <w:bookmarkStart w:id="20" w:name="__RefHeading___Toc2786_1216119672"/>
-      <w:bookmarkEnd w:id="20"/>
+      <w:bookmarkStart w:id="21" w:name="__RefHeading___Toc2786_1216119672"/>
+      <w:bookmarkEnd w:id="21"/>
       <w:r>
         <w:rPr>
           <w:sz w:val="28"/>
@@ -3630,8 +5263,8 @@
         <w:jc w:val="both"/>
         <w:rPr/>
       </w:pPr>
-      <w:bookmarkStart w:id="21" w:name="__RefHeading___Toc2788_1216119672"/>
-      <w:bookmarkEnd w:id="21"/>
+      <w:bookmarkStart w:id="22" w:name="__RefHeading___Toc2788_1216119672"/>
+      <w:bookmarkEnd w:id="22"/>
       <w:r>
         <w:rPr>
           <w:b w:val="false"/>
@@ -3644,6 +5277,7 @@
       <w:r>
         <w:rPr>
           <w:rStyle w:val="SourceText"/>
+          <w:rFonts w:ascii="Times New Roman" w:hAnsi="Times New Roman"/>
           <w:b w:val="false"/>
           <w:bCs w:val="false"/>
           <w:sz w:val="28"/>
@@ -3681,8 +5315,8 @@
           <w:szCs w:val="28"/>
         </w:rPr>
       </w:pPr>
-      <w:bookmarkStart w:id="22" w:name="__RefHeading___Toc2790_1216119672"/>
-      <w:bookmarkEnd w:id="22"/>
+      <w:bookmarkStart w:id="23" w:name="__RefHeading___Toc2790_1216119672"/>
+      <w:bookmarkEnd w:id="23"/>
       <w:r>
         <w:rPr>
           <w:sz w:val="28"/>
@@ -3707,8 +5341,8 @@
         <w:jc w:val="both"/>
         <w:rPr/>
       </w:pPr>
-      <w:bookmarkStart w:id="23" w:name="__RefHeading___Toc2792_1216119672"/>
-      <w:bookmarkEnd w:id="23"/>
+      <w:bookmarkStart w:id="24" w:name="__RefHeading___Toc2792_1216119672"/>
+      <w:bookmarkEnd w:id="24"/>
       <w:r>
         <w:rPr>
           <w:b w:val="false"/>
@@ -3721,6 +5355,7 @@
       <w:r>
         <w:rPr>
           <w:rStyle w:val="SourceText"/>
+          <w:rFonts w:ascii="Times New Roman" w:hAnsi="Times New Roman"/>
           <w:b w:val="false"/>
           <w:bCs w:val="false"/>
           <w:sz w:val="28"/>
@@ -3758,8 +5393,8 @@
           <w:szCs w:val="28"/>
         </w:rPr>
       </w:pPr>
-      <w:bookmarkStart w:id="24" w:name="__RefHeading___Toc2794_1216119672"/>
-      <w:bookmarkEnd w:id="24"/>
+      <w:bookmarkStart w:id="25" w:name="__RefHeading___Toc2794_1216119672"/>
+      <w:bookmarkEnd w:id="25"/>
       <w:r>
         <w:rPr>
           <w:sz w:val="28"/>
@@ -3788,8 +5423,8 @@
           <w:szCs w:val="28"/>
         </w:rPr>
       </w:pPr>
-      <w:bookmarkStart w:id="25" w:name="__RefHeading___Toc2796_1216119672"/>
-      <w:bookmarkEnd w:id="25"/>
+      <w:bookmarkStart w:id="26" w:name="__RefHeading___Toc2796_1216119672"/>
+      <w:bookmarkEnd w:id="26"/>
       <w:r>
         <w:rPr>
           <w:sz w:val="28"/>
@@ -3818,8 +5453,8 @@
           <w:szCs w:val="28"/>
         </w:rPr>
       </w:pPr>
-      <w:bookmarkStart w:id="26" w:name="__RefHeading___Toc2798_1216119672"/>
-      <w:bookmarkEnd w:id="26"/>
+      <w:bookmarkStart w:id="27" w:name="__RefHeading___Toc2798_1216119672"/>
+      <w:bookmarkEnd w:id="27"/>
       <w:r>
         <w:rPr>
           <w:sz w:val="28"/>
@@ -4211,8 +5846,34 @@
           <w:szCs w:val="28"/>
         </w:rPr>
       </w:pPr>
-      <w:bookmarkStart w:id="27" w:name="__RefHeading___Toc2800_1216119672"/>
-      <w:bookmarkEnd w:id="27"/>
+      <w:r>
+        <w:rPr/>
+      </w:r>
+    </w:p>
+    <w:p>
+      <w:pPr>
+        <w:pStyle w:val="Heading2"/>
+        <w:jc w:val="center"/>
+        <w:rPr>
+          <w:sz w:val="28"/>
+          <w:szCs w:val="28"/>
+        </w:rPr>
+      </w:pPr>
+      <w:r>
+        <w:rPr/>
+      </w:r>
+    </w:p>
+    <w:p>
+      <w:pPr>
+        <w:pStyle w:val="Heading2"/>
+        <w:jc w:val="center"/>
+        <w:rPr>
+          <w:sz w:val="28"/>
+          <w:szCs w:val="28"/>
+        </w:rPr>
+      </w:pPr>
+      <w:bookmarkStart w:id="28" w:name="__RefHeading___Toc2800_1216119672"/>
+      <w:bookmarkEnd w:id="28"/>
       <w:r>
         <w:rPr>
           <w:rFonts w:ascii="Times New Roman" w:hAnsi="Times New Roman"/>
@@ -4372,8 +6033,8 @@
           <w:szCs w:val="28"/>
         </w:rPr>
       </w:pPr>
-      <w:bookmarkStart w:id="28" w:name="__RefHeading___Toc2802_1216119672"/>
-      <w:bookmarkEnd w:id="28"/>
+      <w:bookmarkStart w:id="29" w:name="__RefHeading___Toc2802_1216119672"/>
+      <w:bookmarkEnd w:id="29"/>
       <w:r>
         <w:rPr>
           <w:b w:val="false"/>
@@ -4395,8 +6056,8 @@
           <w:szCs w:val="28"/>
         </w:rPr>
       </w:pPr>
-      <w:bookmarkStart w:id="29" w:name="__RefHeading___Toc2804_1216119672"/>
-      <w:bookmarkEnd w:id="29"/>
+      <w:bookmarkStart w:id="30" w:name="__RefHeading___Toc2804_1216119672"/>
+      <w:bookmarkEnd w:id="30"/>
       <w:r>
         <w:rPr>
           <w:b w:val="false"/>
@@ -4415,8 +6076,8 @@
         <w:jc w:val="both"/>
         <w:rPr/>
       </w:pPr>
-      <w:bookmarkStart w:id="30" w:name="__RefHeading___Toc2806_1216119672"/>
-      <w:bookmarkEnd w:id="30"/>
+      <w:bookmarkStart w:id="31" w:name="__RefHeading___Toc2806_1216119672"/>
+      <w:bookmarkEnd w:id="31"/>
       <w:r>
         <w:rPr>
           <w:b w:val="false"/>
@@ -4706,8 +6367,8 @@
           <w:szCs w:val="28"/>
         </w:rPr>
       </w:pPr>
-      <w:bookmarkStart w:id="31" w:name="__RefHeading___Toc2808_1216119672"/>
-      <w:bookmarkEnd w:id="31"/>
+      <w:bookmarkStart w:id="32" w:name="__RefHeading___Toc2808_1216119672"/>
+      <w:bookmarkEnd w:id="32"/>
       <w:r>
         <w:rPr>
           <w:sz w:val="28"/>
@@ -4743,8 +6404,8 @@
           <w:szCs w:val="28"/>
         </w:rPr>
       </w:pPr>
-      <w:bookmarkStart w:id="32" w:name="__RefHeading___Toc2810_1216119672"/>
-      <w:bookmarkEnd w:id="32"/>
+      <w:bookmarkStart w:id="33" w:name="__RefHeading___Toc2810_1216119672"/>
+      <w:bookmarkEnd w:id="33"/>
       <w:r>
         <w:rPr>
           <w:b w:val="false"/>
@@ -4766,8 +6427,8 @@
           <w:szCs w:val="28"/>
         </w:rPr>
       </w:pPr>
-      <w:bookmarkStart w:id="33" w:name="__RefHeading___Toc2812_1216119672"/>
-      <w:bookmarkEnd w:id="33"/>
+      <w:bookmarkStart w:id="34" w:name="__RefHeading___Toc2812_1216119672"/>
+      <w:bookmarkEnd w:id="34"/>
       <w:r>
         <w:rPr>
           <w:sz w:val="28"/>
@@ -4787,8 +6448,8 @@
           <w:szCs w:val="28"/>
         </w:rPr>
       </w:pPr>
-      <w:bookmarkStart w:id="34" w:name="__RefHeading___Toc2814_1216119672"/>
-      <w:bookmarkEnd w:id="34"/>
+      <w:bookmarkStart w:id="35" w:name="__RefHeading___Toc2814_1216119672"/>
+      <w:bookmarkEnd w:id="35"/>
       <w:r>
         <w:rPr>
           <w:sz w:val="28"/>
@@ -4808,8 +6469,8 @@
           <w:szCs w:val="28"/>
         </w:rPr>
       </w:pPr>
-      <w:bookmarkStart w:id="35" w:name="__RefHeading___Toc2816_1216119672"/>
-      <w:bookmarkEnd w:id="35"/>
+      <w:bookmarkStart w:id="36" w:name="__RefHeading___Toc2816_1216119672"/>
+      <w:bookmarkEnd w:id="36"/>
       <w:r>
         <w:rPr>
           <w:sz w:val="28"/>
@@ -4915,8 +6576,8 @@
           <w:szCs w:val="28"/>
         </w:rPr>
       </w:pPr>
-      <w:bookmarkStart w:id="36" w:name="__RefHeading___Toc2818_1216119672"/>
-      <w:bookmarkEnd w:id="36"/>
+      <w:bookmarkStart w:id="37" w:name="__RefHeading___Toc2818_1216119672"/>
+      <w:bookmarkEnd w:id="37"/>
       <w:r>
         <w:rPr>
           <w:rFonts w:ascii="Times New Roman" w:hAnsi="Times New Roman"/>
@@ -4953,8 +6614,8 @@
         <w:jc w:val="both"/>
         <w:rPr/>
       </w:pPr>
-      <w:bookmarkStart w:id="37" w:name="__RefHeading___Toc2820_1216119672"/>
-      <w:bookmarkEnd w:id="37"/>
+      <w:bookmarkStart w:id="38" w:name="__RefHeading___Toc2820_1216119672"/>
+      <w:bookmarkEnd w:id="38"/>
       <w:r>
         <w:rPr/>
         <w:tab/>
@@ -4992,8 +6653,8 @@
           <w:szCs w:val="28"/>
         </w:rPr>
       </w:pPr>
-      <w:bookmarkStart w:id="38" w:name="__RefHeading___Toc2822_1216119672"/>
-      <w:bookmarkEnd w:id="38"/>
+      <w:bookmarkStart w:id="39" w:name="__RefHeading___Toc2822_1216119672"/>
+      <w:bookmarkEnd w:id="39"/>
       <w:r>
         <w:rPr>
           <w:sz w:val="28"/>
@@ -5013,8 +6674,8 @@
           <w:szCs w:val="28"/>
         </w:rPr>
       </w:pPr>
-      <w:bookmarkStart w:id="39" w:name="__RefHeading___Toc2824_1216119672"/>
-      <w:bookmarkEnd w:id="39"/>
+      <w:bookmarkStart w:id="40" w:name="__RefHeading___Toc2824_1216119672"/>
+      <w:bookmarkEnd w:id="40"/>
       <w:r>
         <w:rPr>
           <w:sz w:val="28"/>
@@ -5239,8 +6900,8 @@
           <w:szCs w:val="28"/>
         </w:rPr>
       </w:pPr>
-      <w:bookmarkStart w:id="40" w:name="__RefHeading___Toc2826_1216119672"/>
-      <w:bookmarkEnd w:id="40"/>
+      <w:bookmarkStart w:id="41" w:name="__RefHeading___Toc2826_1216119672"/>
+      <w:bookmarkEnd w:id="41"/>
       <w:r>
         <w:rPr>
           <w:rFonts w:ascii="Times New Roman" w:hAnsi="Times New Roman"/>
@@ -8285,6 +9946,143 @@
   <w:abstractNum w:abstractNumId="4">
     <w:lvl w:ilvl="0">
       <w:start w:val="1"/>
+      <w:numFmt w:val="bullet"/>
+      <w:lvlText w:val=""/>
+      <w:lvlJc w:val="left"/>
+      <w:pPr>
+        <w:tabs>
+          <w:tab w:val="num" w:pos="709"/>
+        </w:tabs>
+        <w:ind w:left="709" w:hanging="283"/>
+      </w:pPr>
+      <w:rPr>
+        <w:rFonts w:ascii="Symbol" w:hAnsi="Symbol" w:cs="Symbol" w:hint="default"/>
+      </w:rPr>
+    </w:lvl>
+    <w:lvl w:ilvl="1">
+      <w:start w:val="1"/>
+      <w:numFmt w:val="bullet"/>
+      <w:lvlText w:val=""/>
+      <w:lvlJc w:val="left"/>
+      <w:pPr>
+        <w:tabs>
+          <w:tab w:val="num" w:pos="1418"/>
+        </w:tabs>
+        <w:ind w:left="1418" w:hanging="283"/>
+      </w:pPr>
+      <w:rPr>
+        <w:rFonts w:ascii="Symbol" w:hAnsi="Symbol" w:cs="Symbol" w:hint="default"/>
+      </w:rPr>
+    </w:lvl>
+    <w:lvl w:ilvl="2">
+      <w:start w:val="1"/>
+      <w:numFmt w:val="bullet"/>
+      <w:lvlText w:val=""/>
+      <w:lvlJc w:val="left"/>
+      <w:pPr>
+        <w:tabs>
+          <w:tab w:val="num" w:pos="2127"/>
+        </w:tabs>
+        <w:ind w:left="2127" w:hanging="283"/>
+      </w:pPr>
+      <w:rPr>
+        <w:rFonts w:ascii="Symbol" w:hAnsi="Symbol" w:cs="Symbol" w:hint="default"/>
+      </w:rPr>
+    </w:lvl>
+    <w:lvl w:ilvl="3">
+      <w:start w:val="1"/>
+      <w:numFmt w:val="bullet"/>
+      <w:lvlText w:val=""/>
+      <w:lvlJc w:val="left"/>
+      <w:pPr>
+        <w:tabs>
+          <w:tab w:val="num" w:pos="2836"/>
+        </w:tabs>
+        <w:ind w:left="2836" w:hanging="283"/>
+      </w:pPr>
+      <w:rPr>
+        <w:rFonts w:ascii="Symbol" w:hAnsi="Symbol" w:cs="Symbol" w:hint="default"/>
+      </w:rPr>
+    </w:lvl>
+    <w:lvl w:ilvl="4">
+      <w:start w:val="1"/>
+      <w:numFmt w:val="bullet"/>
+      <w:lvlText w:val=""/>
+      <w:lvlJc w:val="left"/>
+      <w:pPr>
+        <w:tabs>
+          <w:tab w:val="num" w:pos="3545"/>
+        </w:tabs>
+        <w:ind w:left="3545" w:hanging="283"/>
+      </w:pPr>
+      <w:rPr>
+        <w:rFonts w:ascii="Symbol" w:hAnsi="Symbol" w:cs="Symbol" w:hint="default"/>
+      </w:rPr>
+    </w:lvl>
+    <w:lvl w:ilvl="5">
+      <w:start w:val="1"/>
+      <w:numFmt w:val="bullet"/>
+      <w:lvlText w:val=""/>
+      <w:lvlJc w:val="left"/>
+      <w:pPr>
+        <w:tabs>
+          <w:tab w:val="num" w:pos="4254"/>
+        </w:tabs>
+        <w:ind w:left="4254" w:hanging="283"/>
+      </w:pPr>
+      <w:rPr>
+        <w:rFonts w:ascii="Symbol" w:hAnsi="Symbol" w:cs="Symbol" w:hint="default"/>
+      </w:rPr>
+    </w:lvl>
+    <w:lvl w:ilvl="6">
+      <w:start w:val="1"/>
+      <w:numFmt w:val="bullet"/>
+      <w:lvlText w:val=""/>
+      <w:lvlJc w:val="left"/>
+      <w:pPr>
+        <w:tabs>
+          <w:tab w:val="num" w:pos="4963"/>
+        </w:tabs>
+        <w:ind w:left="4963" w:hanging="283"/>
+      </w:pPr>
+      <w:rPr>
+        <w:rFonts w:ascii="Symbol" w:hAnsi="Symbol" w:cs="Symbol" w:hint="default"/>
+      </w:rPr>
+    </w:lvl>
+    <w:lvl w:ilvl="7">
+      <w:start w:val="1"/>
+      <w:numFmt w:val="bullet"/>
+      <w:lvlText w:val=""/>
+      <w:lvlJc w:val="left"/>
+      <w:pPr>
+        <w:tabs>
+          <w:tab w:val="num" w:pos="5672"/>
+        </w:tabs>
+        <w:ind w:left="5672" w:hanging="283"/>
+      </w:pPr>
+      <w:rPr>
+        <w:rFonts w:ascii="Symbol" w:hAnsi="Symbol" w:cs="Symbol" w:hint="default"/>
+      </w:rPr>
+    </w:lvl>
+    <w:lvl w:ilvl="8">
+      <w:start w:val="1"/>
+      <w:numFmt w:val="bullet"/>
+      <w:lvlText w:val=""/>
+      <w:lvlJc w:val="left"/>
+      <w:pPr>
+        <w:tabs>
+          <w:tab w:val="num" w:pos="6381"/>
+        </w:tabs>
+        <w:ind w:left="6381" w:hanging="283"/>
+      </w:pPr>
+      <w:rPr>
+        <w:rFonts w:ascii="Symbol" w:hAnsi="Symbol" w:cs="Symbol" w:hint="default"/>
+      </w:rPr>
+    </w:lvl>
+  </w:abstractNum>
+  <w:abstractNum w:abstractNumId="5">
+    <w:lvl w:ilvl="0">
+      <w:start w:val="1"/>
       <w:numFmt w:val="none"/>
       <w:suff w:val="nothing"/>
       <w:lvlText w:val=""/>
@@ -8412,6 +10210,9 @@
   </w:num>
   <w:num w:numId="4">
     <w:abstractNumId w:val="4"/>
+  </w:num>
+  <w:num w:numId="5">
+    <w:abstractNumId w:val="5"/>
   </w:num>
 </w:numbering>
 </file>

</xml_diff>